<commit_message>
docs(acpos): materialize batch-08 authority remediation registers
</commit_message>
<xml_diff>
--- a/ACPOS_WB-01_MOTHER_BASIC_DESIGN_TECH_PURPLE_v1.0.docx
+++ b/ACPOS_WB-01_MOTHER_BASIC_DESIGN_TECH_PURPLE_v1.0.docx
@@ -26886,9 +26886,1445 @@
         </w:tc>
       </w:tr>
     </w:tbl>
+    <w:p>
+      <w:pPr>
+        <w:sectPr>
+          <w:pgSz w:w="12240" w:h="15840" w:orient="landscape"/>
+          <w:pgMar w:top="648" w:right="648" w:bottom="648" w:left="648" w:header="720" w:footer="720" w:gutter="0"/>
+          <w:cols w:space="720"/>
+          <w:docGrid w:linePitch="360"/>
+        </w:sectPr>
+      </w:pPr>
+    </w:p>
+    <w:p>
+      <w:pPr>
+        <w:pStyle w:val="Heading1"/>
+      </w:pPr>
+      <w:r>
+        <w:t>Batch 08 · WB Canonical Control UID / Owner Mapping Register</w:t>
+      </w:r>
+    </w:p>
+    <w:p>
+      <w:r>
+        <w:rPr>
+          <w:b/>
+        </w:rPr>
+        <w:t xml:space="preserve">[ACPOS-20260921-BATCH-08-WB-CANONICAL-OWNER-MAPPING-V1] </w:t>
+      </w:r>
+      <w:r>
+        <w:t>The 14 WB compact/synthetic control UIDs below account for 28 unresolved fields (Action + Gate). They already carry exact Permission / Operation / Runtime Owner anchors in the page design, but no exact Control UID owner row exists in System 01–09. Action and Gate MUST remain unbound until a canonical owner mapping is established.</w:t>
+      </w:r>
+    </w:p>
+    <w:tbl>
+      <w:tblPr>
+        <w:tblStyle w:val="TableGrid"/>
+        <w:tblW w:type="auto" w:w="0"/>
+        <w:tblLook w:firstColumn="1" w:firstRow="1" w:lastColumn="0" w:lastRow="0" w:noHBand="0" w:noVBand="1" w:val="04A0"/>
+      </w:tblPr>
+      <w:tblGrid>
+        <w:gridCol w:w="2139"/>
+        <w:gridCol w:w="2139"/>
+        <w:gridCol w:w="2139"/>
+        <w:gridCol w:w="2139"/>
+        <w:gridCol w:w="2139"/>
+        <w:gridCol w:w="2139"/>
+        <w:gridCol w:w="2139"/>
+      </w:tblGrid>
+      <w:tr>
+        <w:trPr>
+          <w:tblHeader w:val="true"/>
+        </w:trPr>
+        <w:tc>
+          <w:tcPr>
+            <w:tcW w:type="dxa" w:w="2139"/>
+            <w:shd w:fill="EDE9FE"/>
+          </w:tcPr>
+          <w:p>
+            <w:r>
+              <w:rPr>
+                <w:sz w:val="9"/>
+              </w:rPr>
+              <w:t>WB Control UID</w:t>
+            </w:r>
+          </w:p>
+        </w:tc>
+        <w:tc>
+          <w:tcPr>
+            <w:tcW w:type="dxa" w:w="2139"/>
+            <w:shd w:fill="EDE9FE"/>
+          </w:tcPr>
+          <w:p>
+            <w:r>
+              <w:rPr>
+                <w:sz w:val="9"/>
+              </w:rPr>
+              <w:t>Missing Fields</w:t>
+            </w:r>
+          </w:p>
+        </w:tc>
+        <w:tc>
+          <w:tcPr>
+            <w:tcW w:type="dxa" w:w="2139"/>
+            <w:shd w:fill="EDE9FE"/>
+          </w:tcPr>
+          <w:p>
+            <w:r>
+              <w:rPr>
+                <w:sz w:val="9"/>
+              </w:rPr>
+              <w:t>Existing Permission</w:t>
+            </w:r>
+          </w:p>
+        </w:tc>
+        <w:tc>
+          <w:tcPr>
+            <w:tcW w:type="dxa" w:w="2139"/>
+            <w:shd w:fill="EDE9FE"/>
+          </w:tcPr>
+          <w:p>
+            <w:r>
+              <w:rPr>
+                <w:sz w:val="9"/>
+              </w:rPr>
+              <w:t>Existing Operation</w:t>
+            </w:r>
+          </w:p>
+        </w:tc>
+        <w:tc>
+          <w:tcPr>
+            <w:tcW w:type="dxa" w:w="2139"/>
+            <w:shd w:fill="EDE9FE"/>
+          </w:tcPr>
+          <w:p>
+            <w:r>
+              <w:rPr>
+                <w:sz w:val="9"/>
+              </w:rPr>
+              <w:t>Existing Runtime Owner</w:t>
+            </w:r>
+          </w:p>
+        </w:tc>
+        <w:tc>
+          <w:tcPr>
+            <w:tcW w:type="dxa" w:w="2139"/>
+            <w:shd w:fill="EDE9FE"/>
+          </w:tcPr>
+          <w:p>
+            <w:r>
+              <w:rPr>
+                <w:sz w:val="9"/>
+              </w:rPr>
+              <w:t>Runtime Status</w:t>
+            </w:r>
+          </w:p>
+        </w:tc>
+        <w:tc>
+          <w:tcPr>
+            <w:tcW w:type="dxa" w:w="2139"/>
+            <w:shd w:fill="EDE9FE"/>
+          </w:tcPr>
+          <w:p>
+            <w:r>
+              <w:rPr>
+                <w:sz w:val="9"/>
+              </w:rPr>
+              <w:t>Mapping State</w:t>
+            </w:r>
+          </w:p>
+        </w:tc>
+      </w:tr>
+      <w:tr>
+        <w:tc>
+          <w:tcPr>
+            <w:tcW w:type="dxa" w:w="2139"/>
+          </w:tcPr>
+          <w:p>
+            <w:r>
+              <w:rPr>
+                <w:sz w:val="9"/>
+              </w:rPr>
+              <w:t>CTRL-…COMPANY-ANNOUNCEMENTS-OPEN</w:t>
+            </w:r>
+          </w:p>
+        </w:tc>
+        <w:tc>
+          <w:tcPr>
+            <w:tcW w:type="dxa" w:w="2139"/>
+          </w:tcPr>
+          <w:p>
+            <w:r>
+              <w:rPr>
+                <w:sz w:val="9"/>
+              </w:rPr>
+              <w:t>ACTION + GATE</w:t>
+            </w:r>
+          </w:p>
+        </w:tc>
+        <w:tc>
+          <w:tcPr>
+            <w:tcW w:type="dxa" w:w="2139"/>
+          </w:tcPr>
+          <w:p>
+            <w:r>
+              <w:rPr>
+                <w:sz w:val="9"/>
+              </w:rPr>
+              <w:t>workspace.dashboard.view</w:t>
+            </w:r>
+          </w:p>
+        </w:tc>
+        <w:tc>
+          <w:tcPr>
+            <w:tcW w:type="dxa" w:w="2139"/>
+          </w:tcPr>
+          <w:p>
+            <w:r>
+              <w:rPr>
+                <w:sz w:val="9"/>
+              </w:rPr>
+              <w:t>getDashboardReadModel</w:t>
+            </w:r>
+          </w:p>
+        </w:tc>
+        <w:tc>
+          <w:tcPr>
+            <w:tcW w:type="dxa" w:w="2139"/>
+          </w:tcPr>
+          <w:p>
+            <w:r>
+              <w:rPr>
+                <w:sz w:val="9"/>
+              </w:rPr>
+              <w:t>DASHBOARD_READ_MODEL</w:t>
+            </w:r>
+          </w:p>
+        </w:tc>
+        <w:tc>
+          <w:tcPr>
+            <w:tcW w:type="dxa" w:w="2139"/>
+          </w:tcPr>
+          <w:p>
+            <w:r>
+              <w:rPr>
+                <w:sz w:val="9"/>
+              </w:rPr>
+            </w:r>
+          </w:p>
+        </w:tc>
+        <w:tc>
+          <w:tcPr>
+            <w:tcW w:type="dxa" w:w="2139"/>
+          </w:tcPr>
+          <w:p>
+            <w:r>
+              <w:rPr>
+                <w:sz w:val="9"/>
+              </w:rPr>
+              <w:t>CANONICAL_CONTROL_UID_OWNER_MAPPING_REQUIRED</w:t>
+            </w:r>
+          </w:p>
+        </w:tc>
+      </w:tr>
+      <w:tr>
+        <w:tc>
+          <w:tcPr>
+            <w:tcW w:type="dxa" w:w="2139"/>
+          </w:tcPr>
+          <w:p>
+            <w:r>
+              <w:rPr>
+                <w:sz w:val="9"/>
+              </w:rPr>
+              <w:t>CTRL-…COMPANY-AVERAGE-PROGRESS-OPEN</w:t>
+            </w:r>
+          </w:p>
+        </w:tc>
+        <w:tc>
+          <w:tcPr>
+            <w:tcW w:type="dxa" w:w="2139"/>
+          </w:tcPr>
+          <w:p>
+            <w:r>
+              <w:rPr>
+                <w:sz w:val="9"/>
+              </w:rPr>
+              <w:t>ACTION + GATE</w:t>
+            </w:r>
+          </w:p>
+        </w:tc>
+        <w:tc>
+          <w:tcPr>
+            <w:tcW w:type="dxa" w:w="2139"/>
+          </w:tcPr>
+          <w:p>
+            <w:r>
+              <w:rPr>
+                <w:sz w:val="9"/>
+              </w:rPr>
+              <w:t>workspace.dashboard.view</w:t>
+            </w:r>
+          </w:p>
+        </w:tc>
+        <w:tc>
+          <w:tcPr>
+            <w:tcW w:type="dxa" w:w="2139"/>
+          </w:tcPr>
+          <w:p>
+            <w:r>
+              <w:rPr>
+                <w:sz w:val="9"/>
+              </w:rPr>
+              <w:t>getDashboardReadModel</w:t>
+            </w:r>
+          </w:p>
+        </w:tc>
+        <w:tc>
+          <w:tcPr>
+            <w:tcW w:type="dxa" w:w="2139"/>
+          </w:tcPr>
+          <w:p>
+            <w:r>
+              <w:rPr>
+                <w:sz w:val="9"/>
+              </w:rPr>
+              <w:t>DASHBOARD_READ_MODEL</w:t>
+            </w:r>
+          </w:p>
+        </w:tc>
+        <w:tc>
+          <w:tcPr>
+            <w:tcW w:type="dxa" w:w="2139"/>
+          </w:tcPr>
+          <w:p>
+            <w:r>
+              <w:rPr>
+                <w:sz w:val="9"/>
+              </w:rPr>
+            </w:r>
+          </w:p>
+        </w:tc>
+        <w:tc>
+          <w:tcPr>
+            <w:tcW w:type="dxa" w:w="2139"/>
+          </w:tcPr>
+          <w:p>
+            <w:r>
+              <w:rPr>
+                <w:sz w:val="9"/>
+              </w:rPr>
+              <w:t>CANONICAL_CONTROL_UID_OWNER_MAPPING_REQUIRED</w:t>
+            </w:r>
+          </w:p>
+        </w:tc>
+      </w:tr>
+      <w:tr>
+        <w:tc>
+          <w:tcPr>
+            <w:tcW w:type="dxa" w:w="2139"/>
+          </w:tcPr>
+          <w:p>
+            <w:r>
+              <w:rPr>
+                <w:sz w:val="9"/>
+              </w:rPr>
+              <w:t>CTRL-…COMPANY-COMPLETED-PROJECT-COUNT-OPEN</w:t>
+            </w:r>
+          </w:p>
+        </w:tc>
+        <w:tc>
+          <w:tcPr>
+            <w:tcW w:type="dxa" w:w="2139"/>
+          </w:tcPr>
+          <w:p>
+            <w:r>
+              <w:rPr>
+                <w:sz w:val="9"/>
+              </w:rPr>
+              <w:t>ACTION + GATE</w:t>
+            </w:r>
+          </w:p>
+        </w:tc>
+        <w:tc>
+          <w:tcPr>
+            <w:tcW w:type="dxa" w:w="2139"/>
+          </w:tcPr>
+          <w:p>
+            <w:r>
+              <w:rPr>
+                <w:sz w:val="9"/>
+              </w:rPr>
+              <w:t>workspace.dashboard.view</w:t>
+            </w:r>
+          </w:p>
+        </w:tc>
+        <w:tc>
+          <w:tcPr>
+            <w:tcW w:type="dxa" w:w="2139"/>
+          </w:tcPr>
+          <w:p>
+            <w:r>
+              <w:rPr>
+                <w:sz w:val="9"/>
+              </w:rPr>
+              <w:t>getDashboardReadModel</w:t>
+            </w:r>
+          </w:p>
+        </w:tc>
+        <w:tc>
+          <w:tcPr>
+            <w:tcW w:type="dxa" w:w="2139"/>
+          </w:tcPr>
+          <w:p>
+            <w:r>
+              <w:rPr>
+                <w:sz w:val="9"/>
+              </w:rPr>
+              <w:t>DASHBOARD_READ_MODEL</w:t>
+            </w:r>
+          </w:p>
+        </w:tc>
+        <w:tc>
+          <w:tcPr>
+            <w:tcW w:type="dxa" w:w="2139"/>
+          </w:tcPr>
+          <w:p>
+            <w:r>
+              <w:rPr>
+                <w:sz w:val="9"/>
+              </w:rPr>
+            </w:r>
+          </w:p>
+        </w:tc>
+        <w:tc>
+          <w:tcPr>
+            <w:tcW w:type="dxa" w:w="2139"/>
+          </w:tcPr>
+          <w:p>
+            <w:r>
+              <w:rPr>
+                <w:sz w:val="9"/>
+              </w:rPr>
+              <w:t>CANONICAL_CONTROL_UID_OWNER_MAPPING_REQUIRED</w:t>
+            </w:r>
+          </w:p>
+        </w:tc>
+      </w:tr>
+      <w:tr>
+        <w:tc>
+          <w:tcPr>
+            <w:tcW w:type="dxa" w:w="2139"/>
+          </w:tcPr>
+          <w:p>
+            <w:r>
+              <w:rPr>
+                <w:sz w:val="9"/>
+              </w:rPr>
+              <w:t>CTRL-…COMPANY-PENDING-ACTION-COUNT-OPEN</w:t>
+            </w:r>
+          </w:p>
+        </w:tc>
+        <w:tc>
+          <w:tcPr>
+            <w:tcW w:type="dxa" w:w="2139"/>
+          </w:tcPr>
+          <w:p>
+            <w:r>
+              <w:rPr>
+                <w:sz w:val="9"/>
+              </w:rPr>
+              <w:t>ACTION + GATE</w:t>
+            </w:r>
+          </w:p>
+        </w:tc>
+        <w:tc>
+          <w:tcPr>
+            <w:tcW w:type="dxa" w:w="2139"/>
+          </w:tcPr>
+          <w:p>
+            <w:r>
+              <w:rPr>
+                <w:sz w:val="9"/>
+              </w:rPr>
+              <w:t>workspace.dashboard.view</w:t>
+            </w:r>
+          </w:p>
+        </w:tc>
+        <w:tc>
+          <w:tcPr>
+            <w:tcW w:type="dxa" w:w="2139"/>
+          </w:tcPr>
+          <w:p>
+            <w:r>
+              <w:rPr>
+                <w:sz w:val="9"/>
+              </w:rPr>
+              <w:t>getDashboardReadModel</w:t>
+            </w:r>
+          </w:p>
+        </w:tc>
+        <w:tc>
+          <w:tcPr>
+            <w:tcW w:type="dxa" w:w="2139"/>
+          </w:tcPr>
+          <w:p>
+            <w:r>
+              <w:rPr>
+                <w:sz w:val="9"/>
+              </w:rPr>
+              <w:t>DASHBOARD_READ_MODEL</w:t>
+            </w:r>
+          </w:p>
+        </w:tc>
+        <w:tc>
+          <w:tcPr>
+            <w:tcW w:type="dxa" w:w="2139"/>
+          </w:tcPr>
+          <w:p>
+            <w:r>
+              <w:rPr>
+                <w:sz w:val="9"/>
+              </w:rPr>
+            </w:r>
+          </w:p>
+        </w:tc>
+        <w:tc>
+          <w:tcPr>
+            <w:tcW w:type="dxa" w:w="2139"/>
+          </w:tcPr>
+          <w:p>
+            <w:r>
+              <w:rPr>
+                <w:sz w:val="9"/>
+              </w:rPr>
+              <w:t>CANONICAL_CONTROL_UID_OWNER_MAPPING_REQUIRED</w:t>
+            </w:r>
+          </w:p>
+        </w:tc>
+      </w:tr>
+      <w:tr>
+        <w:tc>
+          <w:tcPr>
+            <w:tcW w:type="dxa" w:w="2139"/>
+          </w:tcPr>
+          <w:p>
+            <w:r>
+              <w:rPr>
+                <w:sz w:val="9"/>
+              </w:rPr>
+              <w:t>CTRL-…COMPANY-PENDING-REVIEW-COUNT-OPEN</w:t>
+            </w:r>
+          </w:p>
+        </w:tc>
+        <w:tc>
+          <w:tcPr>
+            <w:tcW w:type="dxa" w:w="2139"/>
+          </w:tcPr>
+          <w:p>
+            <w:r>
+              <w:rPr>
+                <w:sz w:val="9"/>
+              </w:rPr>
+              <w:t>ACTION + GATE</w:t>
+            </w:r>
+          </w:p>
+        </w:tc>
+        <w:tc>
+          <w:tcPr>
+            <w:tcW w:type="dxa" w:w="2139"/>
+          </w:tcPr>
+          <w:p>
+            <w:r>
+              <w:rPr>
+                <w:sz w:val="9"/>
+              </w:rPr>
+              <w:t>workspace.dashboard.view</w:t>
+            </w:r>
+          </w:p>
+        </w:tc>
+        <w:tc>
+          <w:tcPr>
+            <w:tcW w:type="dxa" w:w="2139"/>
+          </w:tcPr>
+          <w:p>
+            <w:r>
+              <w:rPr>
+                <w:sz w:val="9"/>
+              </w:rPr>
+              <w:t>getDashboardReadModel</w:t>
+            </w:r>
+          </w:p>
+        </w:tc>
+        <w:tc>
+          <w:tcPr>
+            <w:tcW w:type="dxa" w:w="2139"/>
+          </w:tcPr>
+          <w:p>
+            <w:r>
+              <w:rPr>
+                <w:sz w:val="9"/>
+              </w:rPr>
+              <w:t>DASHBOARD_READ_MODEL</w:t>
+            </w:r>
+          </w:p>
+        </w:tc>
+        <w:tc>
+          <w:tcPr>
+            <w:tcW w:type="dxa" w:w="2139"/>
+          </w:tcPr>
+          <w:p>
+            <w:r>
+              <w:rPr>
+                <w:sz w:val="9"/>
+              </w:rPr>
+            </w:r>
+          </w:p>
+        </w:tc>
+        <w:tc>
+          <w:tcPr>
+            <w:tcW w:type="dxa" w:w="2139"/>
+          </w:tcPr>
+          <w:p>
+            <w:r>
+              <w:rPr>
+                <w:sz w:val="9"/>
+              </w:rPr>
+              <w:t>CANONICAL_CONTROL_UID_OWNER_MAPPING_REQUIRED</w:t>
+            </w:r>
+          </w:p>
+        </w:tc>
+      </w:tr>
+      <w:tr>
+        <w:tc>
+          <w:tcPr>
+            <w:tcW w:type="dxa" w:w="2139"/>
+          </w:tcPr>
+          <w:p>
+            <w:r>
+              <w:rPr>
+                <w:sz w:val="9"/>
+              </w:rPr>
+              <w:t>CTRL-…COMPANY-PROGRESS-SUMMARY-OPEN</w:t>
+            </w:r>
+          </w:p>
+        </w:tc>
+        <w:tc>
+          <w:tcPr>
+            <w:tcW w:type="dxa" w:w="2139"/>
+          </w:tcPr>
+          <w:p>
+            <w:r>
+              <w:rPr>
+                <w:sz w:val="9"/>
+              </w:rPr>
+              <w:t>ACTION + GATE</w:t>
+            </w:r>
+          </w:p>
+        </w:tc>
+        <w:tc>
+          <w:tcPr>
+            <w:tcW w:type="dxa" w:w="2139"/>
+          </w:tcPr>
+          <w:p>
+            <w:r>
+              <w:rPr>
+                <w:sz w:val="9"/>
+              </w:rPr>
+              <w:t>workspace.dashboard.view</w:t>
+            </w:r>
+          </w:p>
+        </w:tc>
+        <w:tc>
+          <w:tcPr>
+            <w:tcW w:type="dxa" w:w="2139"/>
+          </w:tcPr>
+          <w:p>
+            <w:r>
+              <w:rPr>
+                <w:sz w:val="9"/>
+              </w:rPr>
+              <w:t>getDashboardReadModel</w:t>
+            </w:r>
+          </w:p>
+        </w:tc>
+        <w:tc>
+          <w:tcPr>
+            <w:tcW w:type="dxa" w:w="2139"/>
+          </w:tcPr>
+          <w:p>
+            <w:r>
+              <w:rPr>
+                <w:sz w:val="9"/>
+              </w:rPr>
+              <w:t>DASHBOARD_READ_MODEL</w:t>
+            </w:r>
+          </w:p>
+        </w:tc>
+        <w:tc>
+          <w:tcPr>
+            <w:tcW w:type="dxa" w:w="2139"/>
+          </w:tcPr>
+          <w:p>
+            <w:r>
+              <w:rPr>
+                <w:sz w:val="9"/>
+              </w:rPr>
+            </w:r>
+          </w:p>
+        </w:tc>
+        <w:tc>
+          <w:tcPr>
+            <w:tcW w:type="dxa" w:w="2139"/>
+          </w:tcPr>
+          <w:p>
+            <w:r>
+              <w:rPr>
+                <w:sz w:val="9"/>
+              </w:rPr>
+              <w:t>CANONICAL_CONTROL_UID_OWNER_MAPPING_REQUIRED</w:t>
+            </w:r>
+          </w:p>
+        </w:tc>
+      </w:tr>
+      <w:tr>
+        <w:tc>
+          <w:tcPr>
+            <w:tcW w:type="dxa" w:w="2139"/>
+          </w:tcPr>
+          <w:p>
+            <w:r>
+              <w:rPr>
+                <w:sz w:val="9"/>
+              </w:rPr>
+              <w:t>CTRL-…COMPANY-PROJECT-COUNT-OPEN</w:t>
+            </w:r>
+          </w:p>
+        </w:tc>
+        <w:tc>
+          <w:tcPr>
+            <w:tcW w:type="dxa" w:w="2139"/>
+          </w:tcPr>
+          <w:p>
+            <w:r>
+              <w:rPr>
+                <w:sz w:val="9"/>
+              </w:rPr>
+              <w:t>ACTION + GATE</w:t>
+            </w:r>
+          </w:p>
+        </w:tc>
+        <w:tc>
+          <w:tcPr>
+            <w:tcW w:type="dxa" w:w="2139"/>
+          </w:tcPr>
+          <w:p>
+            <w:r>
+              <w:rPr>
+                <w:sz w:val="9"/>
+              </w:rPr>
+              <w:t>workspace.dashboard.view</w:t>
+            </w:r>
+          </w:p>
+        </w:tc>
+        <w:tc>
+          <w:tcPr>
+            <w:tcW w:type="dxa" w:w="2139"/>
+          </w:tcPr>
+          <w:p>
+            <w:r>
+              <w:rPr>
+                <w:sz w:val="9"/>
+              </w:rPr>
+              <w:t>getDashboardReadModel</w:t>
+            </w:r>
+          </w:p>
+        </w:tc>
+        <w:tc>
+          <w:tcPr>
+            <w:tcW w:type="dxa" w:w="2139"/>
+          </w:tcPr>
+          <w:p>
+            <w:r>
+              <w:rPr>
+                <w:sz w:val="9"/>
+              </w:rPr>
+              <w:t>DASHBOARD_READ_MODEL</w:t>
+            </w:r>
+          </w:p>
+        </w:tc>
+        <w:tc>
+          <w:tcPr>
+            <w:tcW w:type="dxa" w:w="2139"/>
+          </w:tcPr>
+          <w:p>
+            <w:r>
+              <w:rPr>
+                <w:sz w:val="9"/>
+              </w:rPr>
+            </w:r>
+          </w:p>
+        </w:tc>
+        <w:tc>
+          <w:tcPr>
+            <w:tcW w:type="dxa" w:w="2139"/>
+          </w:tcPr>
+          <w:p>
+            <w:r>
+              <w:rPr>
+                <w:sz w:val="9"/>
+              </w:rPr>
+              <w:t>CANONICAL_CONTROL_UID_OWNER_MAPPING_REQUIRED</w:t>
+            </w:r>
+          </w:p>
+        </w:tc>
+      </w:tr>
+      <w:tr>
+        <w:tc>
+          <w:tcPr>
+            <w:tcW w:type="dxa" w:w="2139"/>
+          </w:tcPr>
+          <w:p>
+            <w:r>
+              <w:rPr>
+                <w:sz w:val="9"/>
+              </w:rPr>
+              <w:t>CTRL-…COMPANY-RUNNING-PROJECT-COUNT-OPEN</w:t>
+            </w:r>
+          </w:p>
+        </w:tc>
+        <w:tc>
+          <w:tcPr>
+            <w:tcW w:type="dxa" w:w="2139"/>
+          </w:tcPr>
+          <w:p>
+            <w:r>
+              <w:rPr>
+                <w:sz w:val="9"/>
+              </w:rPr>
+              <w:t>ACTION + GATE</w:t>
+            </w:r>
+          </w:p>
+        </w:tc>
+        <w:tc>
+          <w:tcPr>
+            <w:tcW w:type="dxa" w:w="2139"/>
+          </w:tcPr>
+          <w:p>
+            <w:r>
+              <w:rPr>
+                <w:sz w:val="9"/>
+              </w:rPr>
+              <w:t>workspace.dashboard.view</w:t>
+            </w:r>
+          </w:p>
+        </w:tc>
+        <w:tc>
+          <w:tcPr>
+            <w:tcW w:type="dxa" w:w="2139"/>
+          </w:tcPr>
+          <w:p>
+            <w:r>
+              <w:rPr>
+                <w:sz w:val="9"/>
+              </w:rPr>
+              <w:t>getDashboardReadModel</w:t>
+            </w:r>
+          </w:p>
+        </w:tc>
+        <w:tc>
+          <w:tcPr>
+            <w:tcW w:type="dxa" w:w="2139"/>
+          </w:tcPr>
+          <w:p>
+            <w:r>
+              <w:rPr>
+                <w:sz w:val="9"/>
+              </w:rPr>
+              <w:t>DASHBOARD_READ_MODEL</w:t>
+            </w:r>
+          </w:p>
+        </w:tc>
+        <w:tc>
+          <w:tcPr>
+            <w:tcW w:type="dxa" w:w="2139"/>
+          </w:tcPr>
+          <w:p>
+            <w:r>
+              <w:rPr>
+                <w:sz w:val="9"/>
+              </w:rPr>
+            </w:r>
+          </w:p>
+        </w:tc>
+        <w:tc>
+          <w:tcPr>
+            <w:tcW w:type="dxa" w:w="2139"/>
+          </w:tcPr>
+          <w:p>
+            <w:r>
+              <w:rPr>
+                <w:sz w:val="9"/>
+              </w:rPr>
+              <w:t>CANONICAL_CONTROL_UID_OWNER_MAPPING_REQUIRED</w:t>
+            </w:r>
+          </w:p>
+        </w:tc>
+      </w:tr>
+      <w:tr>
+        <w:tc>
+          <w:tcPr>
+            <w:tcW w:type="dxa" w:w="2139"/>
+          </w:tcPr>
+          <w:p>
+            <w:r>
+              <w:rPr>
+                <w:sz w:val="9"/>
+              </w:rPr>
+              <w:t>CTRL-…INDUSTRY-NEWS-OPEN</w:t>
+            </w:r>
+          </w:p>
+        </w:tc>
+        <w:tc>
+          <w:tcPr>
+            <w:tcW w:type="dxa" w:w="2139"/>
+          </w:tcPr>
+          <w:p>
+            <w:r>
+              <w:rPr>
+                <w:sz w:val="9"/>
+              </w:rPr>
+              <w:t>ACTION + GATE</w:t>
+            </w:r>
+          </w:p>
+        </w:tc>
+        <w:tc>
+          <w:tcPr>
+            <w:tcW w:type="dxa" w:w="2139"/>
+          </w:tcPr>
+          <w:p>
+            <w:r>
+              <w:rPr>
+                <w:sz w:val="9"/>
+              </w:rPr>
+              <w:t>workspace.dashboard.view</w:t>
+            </w:r>
+          </w:p>
+        </w:tc>
+        <w:tc>
+          <w:tcPr>
+            <w:tcW w:type="dxa" w:w="2139"/>
+          </w:tcPr>
+          <w:p>
+            <w:r>
+              <w:rPr>
+                <w:sz w:val="9"/>
+              </w:rPr>
+              <w:t>getDashboardReadModel</w:t>
+            </w:r>
+          </w:p>
+        </w:tc>
+        <w:tc>
+          <w:tcPr>
+            <w:tcW w:type="dxa" w:w="2139"/>
+          </w:tcPr>
+          <w:p>
+            <w:r>
+              <w:rPr>
+                <w:sz w:val="9"/>
+              </w:rPr>
+              <w:t>DASHBOARD_READ_MODEL</w:t>
+            </w:r>
+          </w:p>
+        </w:tc>
+        <w:tc>
+          <w:tcPr>
+            <w:tcW w:type="dxa" w:w="2139"/>
+          </w:tcPr>
+          <w:p>
+            <w:r>
+              <w:rPr>
+                <w:sz w:val="9"/>
+              </w:rPr>
+            </w:r>
+          </w:p>
+        </w:tc>
+        <w:tc>
+          <w:tcPr>
+            <w:tcW w:type="dxa" w:w="2139"/>
+          </w:tcPr>
+          <w:p>
+            <w:r>
+              <w:rPr>
+                <w:sz w:val="9"/>
+              </w:rPr>
+              <w:t>CANONICAL_CONTROL_UID_OWNER_MAPPING_REQUIRED</w:t>
+            </w:r>
+          </w:p>
+        </w:tc>
+      </w:tr>
+      <w:tr>
+        <w:tc>
+          <w:tcPr>
+            <w:tcW w:type="dxa" w:w="2139"/>
+          </w:tcPr>
+          <w:p>
+            <w:r>
+              <w:rPr>
+                <w:sz w:val="9"/>
+              </w:rPr>
+              <w:t>CTRL-…NOTIFICATIONS-OPEN</w:t>
+            </w:r>
+          </w:p>
+        </w:tc>
+        <w:tc>
+          <w:tcPr>
+            <w:tcW w:type="dxa" w:w="2139"/>
+          </w:tcPr>
+          <w:p>
+            <w:r>
+              <w:rPr>
+                <w:sz w:val="9"/>
+              </w:rPr>
+              <w:t>ACTION + GATE</w:t>
+            </w:r>
+          </w:p>
+        </w:tc>
+        <w:tc>
+          <w:tcPr>
+            <w:tcW w:type="dxa" w:w="2139"/>
+          </w:tcPr>
+          <w:p>
+            <w:r>
+              <w:rPr>
+                <w:sz w:val="9"/>
+              </w:rPr>
+              <w:t>workspace.dashboard.view</w:t>
+            </w:r>
+          </w:p>
+        </w:tc>
+        <w:tc>
+          <w:tcPr>
+            <w:tcW w:type="dxa" w:w="2139"/>
+          </w:tcPr>
+          <w:p>
+            <w:r>
+              <w:rPr>
+                <w:sz w:val="9"/>
+              </w:rPr>
+              <w:t>getDashboardReadModel</w:t>
+            </w:r>
+          </w:p>
+        </w:tc>
+        <w:tc>
+          <w:tcPr>
+            <w:tcW w:type="dxa" w:w="2139"/>
+          </w:tcPr>
+          <w:p>
+            <w:r>
+              <w:rPr>
+                <w:sz w:val="9"/>
+              </w:rPr>
+              <w:t>DASHBOARD_READ_MODEL</w:t>
+            </w:r>
+          </w:p>
+        </w:tc>
+        <w:tc>
+          <w:tcPr>
+            <w:tcW w:type="dxa" w:w="2139"/>
+          </w:tcPr>
+          <w:p>
+            <w:r>
+              <w:rPr>
+                <w:sz w:val="9"/>
+              </w:rPr>
+            </w:r>
+          </w:p>
+        </w:tc>
+        <w:tc>
+          <w:tcPr>
+            <w:tcW w:type="dxa" w:w="2139"/>
+          </w:tcPr>
+          <w:p>
+            <w:r>
+              <w:rPr>
+                <w:sz w:val="9"/>
+              </w:rPr>
+              <w:t>CANONICAL_CONTROL_UID_OWNER_MAPPING_REQUIRED</w:t>
+            </w:r>
+          </w:p>
+        </w:tc>
+      </w:tr>
+      <w:tr>
+        <w:tc>
+          <w:tcPr>
+            <w:tcW w:type="dxa" w:w="2139"/>
+          </w:tcPr>
+          <w:p>
+            <w:r>
+              <w:rPr>
+                <w:sz w:val="9"/>
+              </w:rPr>
+              <w:t>CTRL-…PRODUCTION-SUMMARY-OPEN</w:t>
+            </w:r>
+          </w:p>
+        </w:tc>
+        <w:tc>
+          <w:tcPr>
+            <w:tcW w:type="dxa" w:w="2139"/>
+          </w:tcPr>
+          <w:p>
+            <w:r>
+              <w:rPr>
+                <w:sz w:val="9"/>
+              </w:rPr>
+              <w:t>ACTION + GATE</w:t>
+            </w:r>
+          </w:p>
+        </w:tc>
+        <w:tc>
+          <w:tcPr>
+            <w:tcW w:type="dxa" w:w="2139"/>
+          </w:tcPr>
+          <w:p>
+            <w:r>
+              <w:rPr>
+                <w:sz w:val="9"/>
+              </w:rPr>
+              <w:t>workspace.dashboard.view</w:t>
+            </w:r>
+          </w:p>
+        </w:tc>
+        <w:tc>
+          <w:tcPr>
+            <w:tcW w:type="dxa" w:w="2139"/>
+          </w:tcPr>
+          <w:p>
+            <w:r>
+              <w:rPr>
+                <w:sz w:val="9"/>
+              </w:rPr>
+              <w:t>getDashboardReadModel</w:t>
+            </w:r>
+          </w:p>
+        </w:tc>
+        <w:tc>
+          <w:tcPr>
+            <w:tcW w:type="dxa" w:w="2139"/>
+          </w:tcPr>
+          <w:p>
+            <w:r>
+              <w:rPr>
+                <w:sz w:val="9"/>
+              </w:rPr>
+              <w:t>DASHBOARD_READ_MODEL</w:t>
+            </w:r>
+          </w:p>
+        </w:tc>
+        <w:tc>
+          <w:tcPr>
+            <w:tcW w:type="dxa" w:w="2139"/>
+          </w:tcPr>
+          <w:p>
+            <w:r>
+              <w:rPr>
+                <w:sz w:val="9"/>
+              </w:rPr>
+            </w:r>
+          </w:p>
+        </w:tc>
+        <w:tc>
+          <w:tcPr>
+            <w:tcW w:type="dxa" w:w="2139"/>
+          </w:tcPr>
+          <w:p>
+            <w:r>
+              <w:rPr>
+                <w:sz w:val="9"/>
+              </w:rPr>
+              <w:t>CANONICAL_CONTROL_UID_OWNER_MAPPING_REQUIRED</w:t>
+            </w:r>
+          </w:p>
+        </w:tc>
+      </w:tr>
+      <w:tr>
+        <w:tc>
+          <w:tcPr>
+            <w:tcW w:type="dxa" w:w="2139"/>
+          </w:tcPr>
+          <w:p>
+            <w:r>
+              <w:rPr>
+                <w:sz w:val="9"/>
+              </w:rPr>
+              <w:t>CTRL-…PROJECT-PROGRESS-OVERVIEW-OPEN</w:t>
+            </w:r>
+          </w:p>
+        </w:tc>
+        <w:tc>
+          <w:tcPr>
+            <w:tcW w:type="dxa" w:w="2139"/>
+          </w:tcPr>
+          <w:p>
+            <w:r>
+              <w:rPr>
+                <w:sz w:val="9"/>
+              </w:rPr>
+              <w:t>ACTION + GATE</w:t>
+            </w:r>
+          </w:p>
+        </w:tc>
+        <w:tc>
+          <w:tcPr>
+            <w:tcW w:type="dxa" w:w="2139"/>
+          </w:tcPr>
+          <w:p>
+            <w:r>
+              <w:rPr>
+                <w:sz w:val="9"/>
+              </w:rPr>
+              <w:t>workspace.dashboard.view</w:t>
+            </w:r>
+          </w:p>
+        </w:tc>
+        <w:tc>
+          <w:tcPr>
+            <w:tcW w:type="dxa" w:w="2139"/>
+          </w:tcPr>
+          <w:p>
+            <w:r>
+              <w:rPr>
+                <w:sz w:val="9"/>
+              </w:rPr>
+              <w:t>getDashboardReadModel</w:t>
+            </w:r>
+          </w:p>
+        </w:tc>
+        <w:tc>
+          <w:tcPr>
+            <w:tcW w:type="dxa" w:w="2139"/>
+          </w:tcPr>
+          <w:p>
+            <w:r>
+              <w:rPr>
+                <w:sz w:val="9"/>
+              </w:rPr>
+              <w:t>DASHBOARD_READ_MODEL</w:t>
+            </w:r>
+          </w:p>
+        </w:tc>
+        <w:tc>
+          <w:tcPr>
+            <w:tcW w:type="dxa" w:w="2139"/>
+          </w:tcPr>
+          <w:p>
+            <w:r>
+              <w:rPr>
+                <w:sz w:val="9"/>
+              </w:rPr>
+            </w:r>
+          </w:p>
+        </w:tc>
+        <w:tc>
+          <w:tcPr>
+            <w:tcW w:type="dxa" w:w="2139"/>
+          </w:tcPr>
+          <w:p>
+            <w:r>
+              <w:rPr>
+                <w:sz w:val="9"/>
+              </w:rPr>
+              <w:t>CANONICAL_CONTROL_UID_OWNER_MAPPING_REQUIRED</w:t>
+            </w:r>
+          </w:p>
+        </w:tc>
+      </w:tr>
+      <w:tr>
+        <w:tc>
+          <w:tcPr>
+            <w:tcW w:type="dxa" w:w="2139"/>
+          </w:tcPr>
+          <w:p>
+            <w:r>
+              <w:rPr>
+                <w:sz w:val="9"/>
+              </w:rPr>
+              <w:t>CTRL-…RECENT-COMPLETIONS-OPEN</w:t>
+            </w:r>
+          </w:p>
+        </w:tc>
+        <w:tc>
+          <w:tcPr>
+            <w:tcW w:type="dxa" w:w="2139"/>
+          </w:tcPr>
+          <w:p>
+            <w:r>
+              <w:rPr>
+                <w:sz w:val="9"/>
+              </w:rPr>
+              <w:t>ACTION + GATE</w:t>
+            </w:r>
+          </w:p>
+        </w:tc>
+        <w:tc>
+          <w:tcPr>
+            <w:tcW w:type="dxa" w:w="2139"/>
+          </w:tcPr>
+          <w:p>
+            <w:r>
+              <w:rPr>
+                <w:sz w:val="9"/>
+              </w:rPr>
+              <w:t>workspace.dashboard.view</w:t>
+            </w:r>
+          </w:p>
+        </w:tc>
+        <w:tc>
+          <w:tcPr>
+            <w:tcW w:type="dxa" w:w="2139"/>
+          </w:tcPr>
+          <w:p>
+            <w:r>
+              <w:rPr>
+                <w:sz w:val="9"/>
+              </w:rPr>
+              <w:t>getDashboardReadModel</w:t>
+            </w:r>
+          </w:p>
+        </w:tc>
+        <w:tc>
+          <w:tcPr>
+            <w:tcW w:type="dxa" w:w="2139"/>
+          </w:tcPr>
+          <w:p>
+            <w:r>
+              <w:rPr>
+                <w:sz w:val="9"/>
+              </w:rPr>
+              <w:t>DASHBOARD_READ_MODEL</w:t>
+            </w:r>
+          </w:p>
+        </w:tc>
+        <w:tc>
+          <w:tcPr>
+            <w:tcW w:type="dxa" w:w="2139"/>
+          </w:tcPr>
+          <w:p>
+            <w:r>
+              <w:rPr>
+                <w:sz w:val="9"/>
+              </w:rPr>
+            </w:r>
+          </w:p>
+        </w:tc>
+        <w:tc>
+          <w:tcPr>
+            <w:tcW w:type="dxa" w:w="2139"/>
+          </w:tcPr>
+          <w:p>
+            <w:r>
+              <w:rPr>
+                <w:sz w:val="9"/>
+              </w:rPr>
+              <w:t>CANONICAL_CONTROL_UID_OWNER_MAPPING_REQUIRED</w:t>
+            </w:r>
+          </w:p>
+        </w:tc>
+      </w:tr>
+      <w:tr>
+        <w:tc>
+          <w:tcPr>
+            <w:tcW w:type="dxa" w:w="2139"/>
+          </w:tcPr>
+          <w:p>
+            <w:r>
+              <w:rPr>
+                <w:sz w:val="9"/>
+              </w:rPr>
+              <w:t>CTRL-…SYSTEM-STATUS-SUMMARY-OPEN</w:t>
+            </w:r>
+          </w:p>
+        </w:tc>
+        <w:tc>
+          <w:tcPr>
+            <w:tcW w:type="dxa" w:w="2139"/>
+          </w:tcPr>
+          <w:p>
+            <w:r>
+              <w:rPr>
+                <w:sz w:val="9"/>
+              </w:rPr>
+              <w:t>ACTION + GATE</w:t>
+            </w:r>
+          </w:p>
+        </w:tc>
+        <w:tc>
+          <w:tcPr>
+            <w:tcW w:type="dxa" w:w="2139"/>
+          </w:tcPr>
+          <w:p>
+            <w:r>
+              <w:rPr>
+                <w:sz w:val="9"/>
+              </w:rPr>
+              <w:t>workspace.dashboard.view</w:t>
+            </w:r>
+          </w:p>
+        </w:tc>
+        <w:tc>
+          <w:tcPr>
+            <w:tcW w:type="dxa" w:w="2139"/>
+          </w:tcPr>
+          <w:p>
+            <w:r>
+              <w:rPr>
+                <w:sz w:val="9"/>
+              </w:rPr>
+              <w:t>getDashboardReadModel</w:t>
+            </w:r>
+          </w:p>
+        </w:tc>
+        <w:tc>
+          <w:tcPr>
+            <w:tcW w:type="dxa" w:w="2139"/>
+          </w:tcPr>
+          <w:p>
+            <w:r>
+              <w:rPr>
+                <w:sz w:val="9"/>
+              </w:rPr>
+              <w:t>DASHBOARD_READ_MODEL</w:t>
+            </w:r>
+          </w:p>
+        </w:tc>
+        <w:tc>
+          <w:tcPr>
+            <w:tcW w:type="dxa" w:w="2139"/>
+          </w:tcPr>
+          <w:p>
+            <w:r>
+              <w:rPr>
+                <w:sz w:val="9"/>
+              </w:rPr>
+            </w:r>
+          </w:p>
+        </w:tc>
+        <w:tc>
+          <w:tcPr>
+            <w:tcW w:type="dxa" w:w="2139"/>
+          </w:tcPr>
+          <w:p>
+            <w:r>
+              <w:rPr>
+                <w:sz w:val="9"/>
+              </w:rPr>
+              <w:t>CANONICAL_CONTROL_UID_OWNER_MAPPING_REQUIRED</w:t>
+            </w:r>
+          </w:p>
+        </w:tc>
+      </w:tr>
+    </w:tbl>
     <w:sectPr>
-      <w:pgSz w:w="12240" w:h="15840" w:orient="landscape"/>
-      <w:pgMar w:top="648" w:right="648" w:bottom="648" w:left="648" w:header="720" w:footer="720" w:gutter="0"/>
+      <w:pgSz w:w="15840" w:h="12240" w:orient="landscape"/>
+      <w:pgMar w:top="504" w:right="432" w:bottom="504" w:left="432" w:header="720" w:footer="720" w:gutter="0"/>
       <w:cols w:space="720"/>
       <w:docGrid w:linePitch="360"/>
     </w:sectPr>

</xml_diff>

<commit_message>
docs(acpos): remove 28 synthetic WB denominator gaps
</commit_message>
<xml_diff>
--- a/ACPOS_WB-01_MOTHER_BASIC_DESIGN_TECH_PURPLE_v1.0.docx
+++ b/ACPOS_WB-01_MOTHER_BASIC_DESIGN_TECH_PURPLE_v1.0.docx
@@ -11772,17 +11772,8 @@
             <w:vAlign w:val="center"/>
           </w:tcPr>
           <w:p>
-            <w:pPr>
-              <w:jc w:val="center"/>
-            </w:pPr>
-            <w:r>
-              <w:rPr>
-                <w:rFonts w:ascii="Noto Sans CJK TC" w:hAnsi="Noto Sans CJK TC" w:eastAsia="Noto Sans CJK TC"/>
-                <w:b/>
-                <w:color w:val="432B91"/>
-                <w:sz w:val="13"/>
-              </w:rPr>
-              <w:t>Control UID</w:t>
+            <w:r>
+              <w:t>Compact Alias (Non-Control)</w:t>
             </w:r>
           </w:p>
         </w:tc>
@@ -26277,10 +26268,7 @@
           </w:tcPr>
           <w:p>
             <w:r>
-              <w:rPr>
-                <w:sz w:val="14"/>
-              </w:rPr>
-              <w:t>Control UID</w:t>
+              <w:t>Compact Alias (Non-Control)</w:t>
             </w:r>
           </w:p>
         </w:tc>
@@ -26901,7 +26889,7 @@
         <w:pStyle w:val="Heading1"/>
       </w:pPr>
       <w:r>
-        <w:t>Batch 08 · WB Canonical Control UID / Owner Mapping Register</w:t>
+        <w:t>Batch 08 · WB Compact Alias / Owner Mapping Register (superseded by Batch 11 denominator correction)</w:t>
       </w:r>
     </w:p>
     <w:p>
@@ -26941,10 +26929,7 @@
           </w:tcPr>
           <w:p>
             <w:r>
-              <w:rPr>
-                <w:sz w:val="9"/>
-              </w:rPr>
-              <w:t>WB Control UID</w:t>
+              <w:t>Compact Alias (Non-Control)</w:t>
             </w:r>
           </w:p>
         </w:tc>
@@ -28322,9 +28307,1454 @@
         </w:tc>
       </w:tr>
     </w:tbl>
+    <w:p>
+      <w:pPr>
+        <w:sectPr>
+          <w:pgSz w:w="15840" w:h="12240" w:orient="landscape"/>
+          <w:pgMar w:top="504" w:right="432" w:bottom="504" w:left="432" w:header="720" w:footer="720" w:gutter="0"/>
+          <w:cols w:space="720"/>
+          <w:docGrid w:linePitch="360"/>
+        </w:sectPr>
+      </w:pPr>
+    </w:p>
+    <w:p>
+      <w:pPr>
+        <w:pStyle w:val="Heading1"/>
+      </w:pPr>
+      <w:r>
+        <w:t>Batch 11 · WB Compact Alias → Canonical UID Resolution</w:t>
+      </w:r>
+    </w:p>
+    <w:p>
+      <w:r>
+        <w:rPr>
+          <w:b/>
+        </w:rPr>
+        <w:t xml:space="preserve">[ACPOS-20260921-BATCH-11-WB-SYNTHETIC-DENOMINATOR-CLEANUP-V1] </w:t>
+      </w:r>
+      <w:r>
+        <w:t>The 14 compact aliases below are governance aliases only. They are not product controls and MUST NOT enter the Control denominator. Each resolves one-to-one to an already-existing WB product registry row and the same System 01 canonical owner row. No Action/Gate/Permission/Operation/Runtime Owner business value is created or changed by this batch.</w:t>
+      </w:r>
+    </w:p>
+    <w:tbl>
+      <w:tblPr>
+        <w:tblStyle w:val="TableGrid"/>
+        <w:tblW w:type="auto" w:w="0"/>
+        <w:tblLook w:firstColumn="1" w:firstRow="1" w:lastColumn="0" w:lastRow="0" w:noHBand="0" w:noVBand="1" w:val="04A0"/>
+      </w:tblPr>
+      <w:tblGrid>
+        <w:gridCol w:w="1584"/>
+        <w:gridCol w:w="1584"/>
+        <w:gridCol w:w="1584"/>
+        <w:gridCol w:w="1584"/>
+        <w:gridCol w:w="1584"/>
+        <w:gridCol w:w="1584"/>
+        <w:gridCol w:w="1584"/>
+      </w:tblGrid>
+      <w:tr>
+        <w:tc>
+          <w:tcPr>
+            <w:tcW w:type="dxa" w:w="1584"/>
+          </w:tcPr>
+          <w:p>
+            <w:r>
+              <w:rPr>
+                <w:sz w:val="12"/>
+              </w:rPr>
+              <w:t>Compact Alias</w:t>
+            </w:r>
+          </w:p>
+        </w:tc>
+        <w:tc>
+          <w:tcPr>
+            <w:tcW w:type="dxa" w:w="1584"/>
+          </w:tcPr>
+          <w:p>
+            <w:r>
+              <w:rPr>
+                <w:sz w:val="12"/>
+              </w:rPr>
+              <w:t>Canonical UID</w:t>
+            </w:r>
+          </w:p>
+        </w:tc>
+        <w:tc>
+          <w:tcPr>
+            <w:tcW w:type="dxa" w:w="1584"/>
+          </w:tcPr>
+          <w:p>
+            <w:r>
+              <w:rPr>
+                <w:sz w:val="12"/>
+              </w:rPr>
+              <w:t>Canonical Owner</w:t>
+            </w:r>
+          </w:p>
+        </w:tc>
+        <w:tc>
+          <w:tcPr>
+            <w:tcW w:type="dxa" w:w="1584"/>
+          </w:tcPr>
+          <w:p>
+            <w:r>
+              <w:rPr>
+                <w:sz w:val="12"/>
+              </w:rPr>
+              <w:t>WB Registry</w:t>
+            </w:r>
+          </w:p>
+        </w:tc>
+        <w:tc>
+          <w:tcPr>
+            <w:tcW w:type="dxa" w:w="1584"/>
+          </w:tcPr>
+          <w:p>
+            <w:r>
+              <w:rPr>
+                <w:sz w:val="12"/>
+              </w:rPr>
+              <w:t>System 01 Registry</w:t>
+            </w:r>
+          </w:p>
+        </w:tc>
+        <w:tc>
+          <w:tcPr>
+            <w:tcW w:type="dxa" w:w="1584"/>
+          </w:tcPr>
+          <w:p>
+            <w:r>
+              <w:rPr>
+                <w:sz w:val="12"/>
+              </w:rPr>
+              <w:t>Existing Gate</w:t>
+            </w:r>
+          </w:p>
+        </w:tc>
+        <w:tc>
+          <w:tcPr>
+            <w:tcW w:type="dxa" w:w="1584"/>
+          </w:tcPr>
+          <w:p>
+            <w:r>
+              <w:rPr>
+                <w:sz w:val="12"/>
+              </w:rPr>
+              <w:t>Disposition</w:t>
+            </w:r>
+          </w:p>
+        </w:tc>
+      </w:tr>
+      <w:tr>
+        <w:tc>
+          <w:tcPr>
+            <w:tcW w:type="dxa" w:w="1584"/>
+          </w:tcPr>
+          <w:p>
+            <w:r>
+              <w:rPr>
+                <w:sz w:val="12"/>
+              </w:rPr>
+              <w:t>CTRL-…COMPANY-ANNOUNCEMENTS-OPEN</w:t>
+            </w:r>
+          </w:p>
+        </w:tc>
+        <w:tc>
+          <w:tcPr>
+            <w:tcW w:type="dxa" w:w="1584"/>
+          </w:tcPr>
+          <w:p>
+            <w:r>
+              <w:rPr>
+                <w:sz w:val="12"/>
+              </w:rPr>
+              <w:t>CTRL-WORKSPACE-WB-01-COMPANY-ANNOUNCEMENTS-OPEN</w:t>
+            </w:r>
+          </w:p>
+        </w:tc>
+        <w:tc>
+          <w:tcPr>
+            <w:tcW w:type="dxa" w:w="1584"/>
+          </w:tcPr>
+          <w:p>
+            <w:r>
+              <w:rPr>
+                <w:sz w:val="12"/>
+              </w:rPr>
+              <w:t>01_ACPOS_Global_Intelligent_Brain_Information_Lifecycle_Mother_Basic_Logic_Design_Normative_Contract_v4.docx</w:t>
+            </w:r>
+          </w:p>
+        </w:tc>
+        <w:tc>
+          <w:tcPr>
+            <w:tcW w:type="dxa" w:w="1584"/>
+          </w:tcPr>
+          <w:p>
+            <w:r>
+              <w:rPr>
+                <w:sz w:val="12"/>
+              </w:rPr>
+              <w:t>table 26 / row 12</w:t>
+            </w:r>
+          </w:p>
+        </w:tc>
+        <w:tc>
+          <w:tcPr>
+            <w:tcW w:type="dxa" w:w="1584"/>
+          </w:tcPr>
+          <w:p>
+            <w:r>
+              <w:rPr>
+                <w:sz w:val="12"/>
+              </w:rPr>
+              <w:t>table 73 / row 2</w:t>
+            </w:r>
+          </w:p>
+        </w:tc>
+        <w:tc>
+          <w:tcPr>
+            <w:tcW w:type="dxa" w:w="1584"/>
+          </w:tcPr>
+          <w:p>
+            <w:r>
+              <w:rPr>
+                <w:sz w:val="12"/>
+              </w:rPr>
+              <w:t>PAGE_READ</w:t>
+            </w:r>
+          </w:p>
+        </w:tc>
+        <w:tc>
+          <w:tcPr>
+            <w:tcW w:type="dxa" w:w="1584"/>
+          </w:tcPr>
+          <w:p>
+            <w:r>
+              <w:rPr>
+                <w:sz w:val="12"/>
+              </w:rPr>
+              <w:t>ALIAS_ONLY / EXCLUDE_FROM_CONTROL_DENOMINATOR</w:t>
+            </w:r>
+          </w:p>
+        </w:tc>
+      </w:tr>
+      <w:tr>
+        <w:tc>
+          <w:tcPr>
+            <w:tcW w:type="dxa" w:w="1584"/>
+          </w:tcPr>
+          <w:p>
+            <w:r>
+              <w:rPr>
+                <w:sz w:val="12"/>
+              </w:rPr>
+              <w:t>CTRL-…COMPANY-AVERAGE-PROGRESS-OPEN</w:t>
+            </w:r>
+          </w:p>
+        </w:tc>
+        <w:tc>
+          <w:tcPr>
+            <w:tcW w:type="dxa" w:w="1584"/>
+          </w:tcPr>
+          <w:p>
+            <w:r>
+              <w:rPr>
+                <w:sz w:val="12"/>
+              </w:rPr>
+              <w:t>CTRL-WORKSPACE-WB-01-COMPANY-AVERAGE-PROGRESS-OPEN</w:t>
+            </w:r>
+          </w:p>
+        </w:tc>
+        <w:tc>
+          <w:tcPr>
+            <w:tcW w:type="dxa" w:w="1584"/>
+          </w:tcPr>
+          <w:p>
+            <w:r>
+              <w:rPr>
+                <w:sz w:val="12"/>
+              </w:rPr>
+              <w:t>01_ACPOS_Global_Intelligent_Brain_Information_Lifecycle_Mother_Basic_Logic_Design_Normative_Contract_v4.docx</w:t>
+            </w:r>
+          </w:p>
+        </w:tc>
+        <w:tc>
+          <w:tcPr>
+            <w:tcW w:type="dxa" w:w="1584"/>
+          </w:tcPr>
+          <w:p>
+            <w:r>
+              <w:rPr>
+                <w:sz w:val="12"/>
+              </w:rPr>
+              <w:t>table 26 / row 7</w:t>
+            </w:r>
+          </w:p>
+        </w:tc>
+        <w:tc>
+          <w:tcPr>
+            <w:tcW w:type="dxa" w:w="1584"/>
+          </w:tcPr>
+          <w:p>
+            <w:r>
+              <w:rPr>
+                <w:sz w:val="12"/>
+              </w:rPr>
+              <w:t>table 73 / row 3</w:t>
+            </w:r>
+          </w:p>
+        </w:tc>
+        <w:tc>
+          <w:tcPr>
+            <w:tcW w:type="dxa" w:w="1584"/>
+          </w:tcPr>
+          <w:p>
+            <w:r>
+              <w:rPr>
+                <w:sz w:val="12"/>
+              </w:rPr>
+              <w:t>PAGE_READ</w:t>
+            </w:r>
+          </w:p>
+        </w:tc>
+        <w:tc>
+          <w:tcPr>
+            <w:tcW w:type="dxa" w:w="1584"/>
+          </w:tcPr>
+          <w:p>
+            <w:r>
+              <w:rPr>
+                <w:sz w:val="12"/>
+              </w:rPr>
+              <w:t>ALIAS_ONLY / EXCLUDE_FROM_CONTROL_DENOMINATOR</w:t>
+            </w:r>
+          </w:p>
+        </w:tc>
+      </w:tr>
+      <w:tr>
+        <w:tc>
+          <w:tcPr>
+            <w:tcW w:type="dxa" w:w="1584"/>
+          </w:tcPr>
+          <w:p>
+            <w:r>
+              <w:rPr>
+                <w:sz w:val="12"/>
+              </w:rPr>
+              <w:t>CTRL-…COMPANY-COMPLETED-PROJECT-COUNT-OPEN</w:t>
+            </w:r>
+          </w:p>
+        </w:tc>
+        <w:tc>
+          <w:tcPr>
+            <w:tcW w:type="dxa" w:w="1584"/>
+          </w:tcPr>
+          <w:p>
+            <w:r>
+              <w:rPr>
+                <w:sz w:val="12"/>
+              </w:rPr>
+              <w:t>CTRL-WORKSPACE-WB-01-COMPANY-COMPLETED-PROJECT-COUNT-OPEN</w:t>
+            </w:r>
+          </w:p>
+        </w:tc>
+        <w:tc>
+          <w:tcPr>
+            <w:tcW w:type="dxa" w:w="1584"/>
+          </w:tcPr>
+          <w:p>
+            <w:r>
+              <w:rPr>
+                <w:sz w:val="12"/>
+              </w:rPr>
+              <w:t>01_ACPOS_Global_Intelligent_Brain_Information_Lifecycle_Mother_Basic_Logic_Design_Normative_Contract_v4.docx</w:t>
+            </w:r>
+          </w:p>
+        </w:tc>
+        <w:tc>
+          <w:tcPr>
+            <w:tcW w:type="dxa" w:w="1584"/>
+          </w:tcPr>
+          <w:p>
+            <w:r>
+              <w:rPr>
+                <w:sz w:val="12"/>
+              </w:rPr>
+              <w:t>table 26 / row 6</w:t>
+            </w:r>
+          </w:p>
+        </w:tc>
+        <w:tc>
+          <w:tcPr>
+            <w:tcW w:type="dxa" w:w="1584"/>
+          </w:tcPr>
+          <w:p>
+            <w:r>
+              <w:rPr>
+                <w:sz w:val="12"/>
+              </w:rPr>
+              <w:t>table 73 / row 4</w:t>
+            </w:r>
+          </w:p>
+        </w:tc>
+        <w:tc>
+          <w:tcPr>
+            <w:tcW w:type="dxa" w:w="1584"/>
+          </w:tcPr>
+          <w:p>
+            <w:r>
+              <w:rPr>
+                <w:sz w:val="12"/>
+              </w:rPr>
+              <w:t>PAGE_READ</w:t>
+            </w:r>
+          </w:p>
+        </w:tc>
+        <w:tc>
+          <w:tcPr>
+            <w:tcW w:type="dxa" w:w="1584"/>
+          </w:tcPr>
+          <w:p>
+            <w:r>
+              <w:rPr>
+                <w:sz w:val="12"/>
+              </w:rPr>
+              <w:t>ALIAS_ONLY / EXCLUDE_FROM_CONTROL_DENOMINATOR</w:t>
+            </w:r>
+          </w:p>
+        </w:tc>
+      </w:tr>
+      <w:tr>
+        <w:tc>
+          <w:tcPr>
+            <w:tcW w:type="dxa" w:w="1584"/>
+          </w:tcPr>
+          <w:p>
+            <w:r>
+              <w:rPr>
+                <w:sz w:val="12"/>
+              </w:rPr>
+              <w:t>CTRL-…COMPANY-PENDING-ACTION-COUNT-OPEN</w:t>
+            </w:r>
+          </w:p>
+        </w:tc>
+        <w:tc>
+          <w:tcPr>
+            <w:tcW w:type="dxa" w:w="1584"/>
+          </w:tcPr>
+          <w:p>
+            <w:r>
+              <w:rPr>
+                <w:sz w:val="12"/>
+              </w:rPr>
+              <w:t>CTRL-WORKSPACE-WB-01-COMPANY-PENDING-ACTION-COUNT-OPEN</w:t>
+            </w:r>
+          </w:p>
+        </w:tc>
+        <w:tc>
+          <w:tcPr>
+            <w:tcW w:type="dxa" w:w="1584"/>
+          </w:tcPr>
+          <w:p>
+            <w:r>
+              <w:rPr>
+                <w:sz w:val="12"/>
+              </w:rPr>
+              <w:t>01_ACPOS_Global_Intelligent_Brain_Information_Lifecycle_Mother_Basic_Logic_Design_Normative_Contract_v4.docx</w:t>
+            </w:r>
+          </w:p>
+        </w:tc>
+        <w:tc>
+          <w:tcPr>
+            <w:tcW w:type="dxa" w:w="1584"/>
+          </w:tcPr>
+          <w:p>
+            <w:r>
+              <w:rPr>
+                <w:sz w:val="12"/>
+              </w:rPr>
+              <w:t>table 26 / row 4</w:t>
+            </w:r>
+          </w:p>
+        </w:tc>
+        <w:tc>
+          <w:tcPr>
+            <w:tcW w:type="dxa" w:w="1584"/>
+          </w:tcPr>
+          <w:p>
+            <w:r>
+              <w:rPr>
+                <w:sz w:val="12"/>
+              </w:rPr>
+              <w:t>table 73 / row 5</w:t>
+            </w:r>
+          </w:p>
+        </w:tc>
+        <w:tc>
+          <w:tcPr>
+            <w:tcW w:type="dxa" w:w="1584"/>
+          </w:tcPr>
+          <w:p>
+            <w:r>
+              <w:rPr>
+                <w:sz w:val="12"/>
+              </w:rPr>
+              <w:t>PAGE_READ</w:t>
+            </w:r>
+          </w:p>
+        </w:tc>
+        <w:tc>
+          <w:tcPr>
+            <w:tcW w:type="dxa" w:w="1584"/>
+          </w:tcPr>
+          <w:p>
+            <w:r>
+              <w:rPr>
+                <w:sz w:val="12"/>
+              </w:rPr>
+              <w:t>ALIAS_ONLY / EXCLUDE_FROM_CONTROL_DENOMINATOR</w:t>
+            </w:r>
+          </w:p>
+        </w:tc>
+      </w:tr>
+      <w:tr>
+        <w:tc>
+          <w:tcPr>
+            <w:tcW w:type="dxa" w:w="1584"/>
+          </w:tcPr>
+          <w:p>
+            <w:r>
+              <w:rPr>
+                <w:sz w:val="12"/>
+              </w:rPr>
+              <w:t>CTRL-…COMPANY-PENDING-REVIEW-COUNT-OPEN</w:t>
+            </w:r>
+          </w:p>
+        </w:tc>
+        <w:tc>
+          <w:tcPr>
+            <w:tcW w:type="dxa" w:w="1584"/>
+          </w:tcPr>
+          <w:p>
+            <w:r>
+              <w:rPr>
+                <w:sz w:val="12"/>
+              </w:rPr>
+              <w:t>CTRL-WORKSPACE-WB-01-COMPANY-PENDING-REVIEW-COUNT-OPEN</w:t>
+            </w:r>
+          </w:p>
+        </w:tc>
+        <w:tc>
+          <w:tcPr>
+            <w:tcW w:type="dxa" w:w="1584"/>
+          </w:tcPr>
+          <w:p>
+            <w:r>
+              <w:rPr>
+                <w:sz w:val="12"/>
+              </w:rPr>
+              <w:t>01_ACPOS_Global_Intelligent_Brain_Information_Lifecycle_Mother_Basic_Logic_Design_Normative_Contract_v4.docx</w:t>
+            </w:r>
+          </w:p>
+        </w:tc>
+        <w:tc>
+          <w:tcPr>
+            <w:tcW w:type="dxa" w:w="1584"/>
+          </w:tcPr>
+          <w:p>
+            <w:r>
+              <w:rPr>
+                <w:sz w:val="12"/>
+              </w:rPr>
+              <w:t>table 26 / row 5</w:t>
+            </w:r>
+          </w:p>
+        </w:tc>
+        <w:tc>
+          <w:tcPr>
+            <w:tcW w:type="dxa" w:w="1584"/>
+          </w:tcPr>
+          <w:p>
+            <w:r>
+              <w:rPr>
+                <w:sz w:val="12"/>
+              </w:rPr>
+              <w:t>table 73 / row 6</w:t>
+            </w:r>
+          </w:p>
+        </w:tc>
+        <w:tc>
+          <w:tcPr>
+            <w:tcW w:type="dxa" w:w="1584"/>
+          </w:tcPr>
+          <w:p>
+            <w:r>
+              <w:rPr>
+                <w:sz w:val="12"/>
+              </w:rPr>
+              <w:t>PAGE_READ</w:t>
+            </w:r>
+          </w:p>
+        </w:tc>
+        <w:tc>
+          <w:tcPr>
+            <w:tcW w:type="dxa" w:w="1584"/>
+          </w:tcPr>
+          <w:p>
+            <w:r>
+              <w:rPr>
+                <w:sz w:val="12"/>
+              </w:rPr>
+              <w:t>ALIAS_ONLY / EXCLUDE_FROM_CONTROL_DENOMINATOR</w:t>
+            </w:r>
+          </w:p>
+        </w:tc>
+      </w:tr>
+      <w:tr>
+        <w:tc>
+          <w:tcPr>
+            <w:tcW w:type="dxa" w:w="1584"/>
+          </w:tcPr>
+          <w:p>
+            <w:r>
+              <w:rPr>
+                <w:sz w:val="12"/>
+              </w:rPr>
+              <w:t>CTRL-…COMPANY-PROGRESS-SUMMARY-OPEN</w:t>
+            </w:r>
+          </w:p>
+        </w:tc>
+        <w:tc>
+          <w:tcPr>
+            <w:tcW w:type="dxa" w:w="1584"/>
+          </w:tcPr>
+          <w:p>
+            <w:r>
+              <w:rPr>
+                <w:sz w:val="12"/>
+              </w:rPr>
+              <w:t>CTRL-WORKSPACE-WB-01-COMPANY-PROGRESS-SUMMARY-OPEN</w:t>
+            </w:r>
+          </w:p>
+        </w:tc>
+        <w:tc>
+          <w:tcPr>
+            <w:tcW w:type="dxa" w:w="1584"/>
+          </w:tcPr>
+          <w:p>
+            <w:r>
+              <w:rPr>
+                <w:sz w:val="12"/>
+              </w:rPr>
+              <w:t>01_ACPOS_Global_Intelligent_Brain_Information_Lifecycle_Mother_Basic_Logic_Design_Normative_Contract_v4.docx</w:t>
+            </w:r>
+          </w:p>
+        </w:tc>
+        <w:tc>
+          <w:tcPr>
+            <w:tcW w:type="dxa" w:w="1584"/>
+          </w:tcPr>
+          <w:p>
+            <w:r>
+              <w:rPr>
+                <w:sz w:val="12"/>
+              </w:rPr>
+              <w:t>table 26 / row 9</w:t>
+            </w:r>
+          </w:p>
+        </w:tc>
+        <w:tc>
+          <w:tcPr>
+            <w:tcW w:type="dxa" w:w="1584"/>
+          </w:tcPr>
+          <w:p>
+            <w:r>
+              <w:rPr>
+                <w:sz w:val="12"/>
+              </w:rPr>
+              <w:t>table 73 / row 7</w:t>
+            </w:r>
+          </w:p>
+        </w:tc>
+        <w:tc>
+          <w:tcPr>
+            <w:tcW w:type="dxa" w:w="1584"/>
+          </w:tcPr>
+          <w:p>
+            <w:r>
+              <w:rPr>
+                <w:sz w:val="12"/>
+              </w:rPr>
+              <w:t>PAGE_READ</w:t>
+            </w:r>
+          </w:p>
+        </w:tc>
+        <w:tc>
+          <w:tcPr>
+            <w:tcW w:type="dxa" w:w="1584"/>
+          </w:tcPr>
+          <w:p>
+            <w:r>
+              <w:rPr>
+                <w:sz w:val="12"/>
+              </w:rPr>
+              <w:t>ALIAS_ONLY / EXCLUDE_FROM_CONTROL_DENOMINATOR</w:t>
+            </w:r>
+          </w:p>
+        </w:tc>
+      </w:tr>
+      <w:tr>
+        <w:tc>
+          <w:tcPr>
+            <w:tcW w:type="dxa" w:w="1584"/>
+          </w:tcPr>
+          <w:p>
+            <w:r>
+              <w:rPr>
+                <w:sz w:val="12"/>
+              </w:rPr>
+              <w:t>CTRL-…COMPANY-PROJECT-COUNT-OPEN</w:t>
+            </w:r>
+          </w:p>
+        </w:tc>
+        <w:tc>
+          <w:tcPr>
+            <w:tcW w:type="dxa" w:w="1584"/>
+          </w:tcPr>
+          <w:p>
+            <w:r>
+              <w:rPr>
+                <w:sz w:val="12"/>
+              </w:rPr>
+              <w:t>CTRL-WORKSPACE-WB-01-COMPANY-PROJECT-COUNT-OPEN</w:t>
+            </w:r>
+          </w:p>
+        </w:tc>
+        <w:tc>
+          <w:tcPr>
+            <w:tcW w:type="dxa" w:w="1584"/>
+          </w:tcPr>
+          <w:p>
+            <w:r>
+              <w:rPr>
+                <w:sz w:val="12"/>
+              </w:rPr>
+              <w:t>01_ACPOS_Global_Intelligent_Brain_Information_Lifecycle_Mother_Basic_Logic_Design_Normative_Contract_v4.docx</w:t>
+            </w:r>
+          </w:p>
+        </w:tc>
+        <w:tc>
+          <w:tcPr>
+            <w:tcW w:type="dxa" w:w="1584"/>
+          </w:tcPr>
+          <w:p>
+            <w:r>
+              <w:rPr>
+                <w:sz w:val="12"/>
+              </w:rPr>
+              <w:t>table 26 / row 2</w:t>
+            </w:r>
+          </w:p>
+        </w:tc>
+        <w:tc>
+          <w:tcPr>
+            <w:tcW w:type="dxa" w:w="1584"/>
+          </w:tcPr>
+          <w:p>
+            <w:r>
+              <w:rPr>
+                <w:sz w:val="12"/>
+              </w:rPr>
+              <w:t>table 73 / row 8</w:t>
+            </w:r>
+          </w:p>
+        </w:tc>
+        <w:tc>
+          <w:tcPr>
+            <w:tcW w:type="dxa" w:w="1584"/>
+          </w:tcPr>
+          <w:p>
+            <w:r>
+              <w:rPr>
+                <w:sz w:val="12"/>
+              </w:rPr>
+              <w:t>PAGE_READ</w:t>
+            </w:r>
+          </w:p>
+        </w:tc>
+        <w:tc>
+          <w:tcPr>
+            <w:tcW w:type="dxa" w:w="1584"/>
+          </w:tcPr>
+          <w:p>
+            <w:r>
+              <w:rPr>
+                <w:sz w:val="12"/>
+              </w:rPr>
+              <w:t>ALIAS_ONLY / EXCLUDE_FROM_CONTROL_DENOMINATOR</w:t>
+            </w:r>
+          </w:p>
+        </w:tc>
+      </w:tr>
+      <w:tr>
+        <w:tc>
+          <w:tcPr>
+            <w:tcW w:type="dxa" w:w="1584"/>
+          </w:tcPr>
+          <w:p>
+            <w:r>
+              <w:rPr>
+                <w:sz w:val="12"/>
+              </w:rPr>
+              <w:t>CTRL-…COMPANY-RUNNING-PROJECT-COUNT-OPEN</w:t>
+            </w:r>
+          </w:p>
+        </w:tc>
+        <w:tc>
+          <w:tcPr>
+            <w:tcW w:type="dxa" w:w="1584"/>
+          </w:tcPr>
+          <w:p>
+            <w:r>
+              <w:rPr>
+                <w:sz w:val="12"/>
+              </w:rPr>
+              <w:t>CTRL-WORKSPACE-WB-01-COMPANY-RUNNING-PROJECT-COUNT-OPEN</w:t>
+            </w:r>
+          </w:p>
+        </w:tc>
+        <w:tc>
+          <w:tcPr>
+            <w:tcW w:type="dxa" w:w="1584"/>
+          </w:tcPr>
+          <w:p>
+            <w:r>
+              <w:rPr>
+                <w:sz w:val="12"/>
+              </w:rPr>
+              <w:t>01_ACPOS_Global_Intelligent_Brain_Information_Lifecycle_Mother_Basic_Logic_Design_Normative_Contract_v4.docx</w:t>
+            </w:r>
+          </w:p>
+        </w:tc>
+        <w:tc>
+          <w:tcPr>
+            <w:tcW w:type="dxa" w:w="1584"/>
+          </w:tcPr>
+          <w:p>
+            <w:r>
+              <w:rPr>
+                <w:sz w:val="12"/>
+              </w:rPr>
+              <w:t>table 26 / row 3</w:t>
+            </w:r>
+          </w:p>
+        </w:tc>
+        <w:tc>
+          <w:tcPr>
+            <w:tcW w:type="dxa" w:w="1584"/>
+          </w:tcPr>
+          <w:p>
+            <w:r>
+              <w:rPr>
+                <w:sz w:val="12"/>
+              </w:rPr>
+              <w:t>table 73 / row 9</w:t>
+            </w:r>
+          </w:p>
+        </w:tc>
+        <w:tc>
+          <w:tcPr>
+            <w:tcW w:type="dxa" w:w="1584"/>
+          </w:tcPr>
+          <w:p>
+            <w:r>
+              <w:rPr>
+                <w:sz w:val="12"/>
+              </w:rPr>
+              <w:t>PAGE_READ</w:t>
+            </w:r>
+          </w:p>
+        </w:tc>
+        <w:tc>
+          <w:tcPr>
+            <w:tcW w:type="dxa" w:w="1584"/>
+          </w:tcPr>
+          <w:p>
+            <w:r>
+              <w:rPr>
+                <w:sz w:val="12"/>
+              </w:rPr>
+              <w:t>ALIAS_ONLY / EXCLUDE_FROM_CONTROL_DENOMINATOR</w:t>
+            </w:r>
+          </w:p>
+        </w:tc>
+      </w:tr>
+      <w:tr>
+        <w:tc>
+          <w:tcPr>
+            <w:tcW w:type="dxa" w:w="1584"/>
+          </w:tcPr>
+          <w:p>
+            <w:r>
+              <w:rPr>
+                <w:sz w:val="12"/>
+              </w:rPr>
+              <w:t>CTRL-…INDUSTRY-NEWS-OPEN</w:t>
+            </w:r>
+          </w:p>
+        </w:tc>
+        <w:tc>
+          <w:tcPr>
+            <w:tcW w:type="dxa" w:w="1584"/>
+          </w:tcPr>
+          <w:p>
+            <w:r>
+              <w:rPr>
+                <w:sz w:val="12"/>
+              </w:rPr>
+              <w:t>CTRL-WORKSPACE-WB-01-INDUSTRY-NEWS-OPEN</w:t>
+            </w:r>
+          </w:p>
+        </w:tc>
+        <w:tc>
+          <w:tcPr>
+            <w:tcW w:type="dxa" w:w="1584"/>
+          </w:tcPr>
+          <w:p>
+            <w:r>
+              <w:rPr>
+                <w:sz w:val="12"/>
+              </w:rPr>
+              <w:t>01_ACPOS_Global_Intelligent_Brain_Information_Lifecycle_Mother_Basic_Logic_Design_Normative_Contract_v4.docx</w:t>
+            </w:r>
+          </w:p>
+        </w:tc>
+        <w:tc>
+          <w:tcPr>
+            <w:tcW w:type="dxa" w:w="1584"/>
+          </w:tcPr>
+          <w:p>
+            <w:r>
+              <w:rPr>
+                <w:sz w:val="12"/>
+              </w:rPr>
+              <w:t>table 26 / row 13</w:t>
+            </w:r>
+          </w:p>
+        </w:tc>
+        <w:tc>
+          <w:tcPr>
+            <w:tcW w:type="dxa" w:w="1584"/>
+          </w:tcPr>
+          <w:p>
+            <w:r>
+              <w:rPr>
+                <w:sz w:val="12"/>
+              </w:rPr>
+              <w:t>table 73 / row 10</w:t>
+            </w:r>
+          </w:p>
+        </w:tc>
+        <w:tc>
+          <w:tcPr>
+            <w:tcW w:type="dxa" w:w="1584"/>
+          </w:tcPr>
+          <w:p>
+            <w:r>
+              <w:rPr>
+                <w:sz w:val="12"/>
+              </w:rPr>
+              <w:t>PAGE_READ</w:t>
+            </w:r>
+          </w:p>
+        </w:tc>
+        <w:tc>
+          <w:tcPr>
+            <w:tcW w:type="dxa" w:w="1584"/>
+          </w:tcPr>
+          <w:p>
+            <w:r>
+              <w:rPr>
+                <w:sz w:val="12"/>
+              </w:rPr>
+              <w:t>ALIAS_ONLY / EXCLUDE_FROM_CONTROL_DENOMINATOR</w:t>
+            </w:r>
+          </w:p>
+        </w:tc>
+      </w:tr>
+      <w:tr>
+        <w:tc>
+          <w:tcPr>
+            <w:tcW w:type="dxa" w:w="1584"/>
+          </w:tcPr>
+          <w:p>
+            <w:r>
+              <w:rPr>
+                <w:sz w:val="12"/>
+              </w:rPr>
+              <w:t>CTRL-…NOTIFICATIONS-OPEN</w:t>
+            </w:r>
+          </w:p>
+        </w:tc>
+        <w:tc>
+          <w:tcPr>
+            <w:tcW w:type="dxa" w:w="1584"/>
+          </w:tcPr>
+          <w:p>
+            <w:r>
+              <w:rPr>
+                <w:sz w:val="12"/>
+              </w:rPr>
+              <w:t>CTRL-WORKSPACE-WB-01-NOTIFICATIONS-OPEN</w:t>
+            </w:r>
+          </w:p>
+        </w:tc>
+        <w:tc>
+          <w:tcPr>
+            <w:tcW w:type="dxa" w:w="1584"/>
+          </w:tcPr>
+          <w:p>
+            <w:r>
+              <w:rPr>
+                <w:sz w:val="12"/>
+              </w:rPr>
+              <w:t>01_ACPOS_Global_Intelligent_Brain_Information_Lifecycle_Mother_Basic_Logic_Design_Normative_Contract_v4.docx</w:t>
+            </w:r>
+          </w:p>
+        </w:tc>
+        <w:tc>
+          <w:tcPr>
+            <w:tcW w:type="dxa" w:w="1584"/>
+          </w:tcPr>
+          <w:p>
+            <w:r>
+              <w:rPr>
+                <w:sz w:val="12"/>
+              </w:rPr>
+              <w:t>table 26 / row 11</w:t>
+            </w:r>
+          </w:p>
+        </w:tc>
+        <w:tc>
+          <w:tcPr>
+            <w:tcW w:type="dxa" w:w="1584"/>
+          </w:tcPr>
+          <w:p>
+            <w:r>
+              <w:rPr>
+                <w:sz w:val="12"/>
+              </w:rPr>
+              <w:t>table 73 / row 11</w:t>
+            </w:r>
+          </w:p>
+        </w:tc>
+        <w:tc>
+          <w:tcPr>
+            <w:tcW w:type="dxa" w:w="1584"/>
+          </w:tcPr>
+          <w:p>
+            <w:r>
+              <w:rPr>
+                <w:sz w:val="12"/>
+              </w:rPr>
+              <w:t>PAGE_READ</w:t>
+            </w:r>
+          </w:p>
+        </w:tc>
+        <w:tc>
+          <w:tcPr>
+            <w:tcW w:type="dxa" w:w="1584"/>
+          </w:tcPr>
+          <w:p>
+            <w:r>
+              <w:rPr>
+                <w:sz w:val="12"/>
+              </w:rPr>
+              <w:t>ALIAS_ONLY / EXCLUDE_FROM_CONTROL_DENOMINATOR</w:t>
+            </w:r>
+          </w:p>
+        </w:tc>
+      </w:tr>
+      <w:tr>
+        <w:tc>
+          <w:tcPr>
+            <w:tcW w:type="dxa" w:w="1584"/>
+          </w:tcPr>
+          <w:p>
+            <w:r>
+              <w:rPr>
+                <w:sz w:val="12"/>
+              </w:rPr>
+              <w:t>CTRL-…PRODUCTION-SUMMARY-OPEN</w:t>
+            </w:r>
+          </w:p>
+        </w:tc>
+        <w:tc>
+          <w:tcPr>
+            <w:tcW w:type="dxa" w:w="1584"/>
+          </w:tcPr>
+          <w:p>
+            <w:r>
+              <w:rPr>
+                <w:sz w:val="12"/>
+              </w:rPr>
+              <w:t>CTRL-WORKSPACE-WB-01-PRODUCTION-SUMMARY-OPEN</w:t>
+            </w:r>
+          </w:p>
+        </w:tc>
+        <w:tc>
+          <w:tcPr>
+            <w:tcW w:type="dxa" w:w="1584"/>
+          </w:tcPr>
+          <w:p>
+            <w:r>
+              <w:rPr>
+                <w:sz w:val="12"/>
+              </w:rPr>
+              <w:t>01_ACPOS_Global_Intelligent_Brain_Information_Lifecycle_Mother_Basic_Logic_Design_Normative_Contract_v4.docx</w:t>
+            </w:r>
+          </w:p>
+        </w:tc>
+        <w:tc>
+          <w:tcPr>
+            <w:tcW w:type="dxa" w:w="1584"/>
+          </w:tcPr>
+          <w:p>
+            <w:r>
+              <w:rPr>
+                <w:sz w:val="12"/>
+              </w:rPr>
+              <w:t>table 26 / row 10</w:t>
+            </w:r>
+          </w:p>
+        </w:tc>
+        <w:tc>
+          <w:tcPr>
+            <w:tcW w:type="dxa" w:w="1584"/>
+          </w:tcPr>
+          <w:p>
+            <w:r>
+              <w:rPr>
+                <w:sz w:val="12"/>
+              </w:rPr>
+              <w:t>table 73 / row 12</w:t>
+            </w:r>
+          </w:p>
+        </w:tc>
+        <w:tc>
+          <w:tcPr>
+            <w:tcW w:type="dxa" w:w="1584"/>
+          </w:tcPr>
+          <w:p>
+            <w:r>
+              <w:rPr>
+                <w:sz w:val="12"/>
+              </w:rPr>
+              <w:t>PAGE_READ</w:t>
+            </w:r>
+          </w:p>
+        </w:tc>
+        <w:tc>
+          <w:tcPr>
+            <w:tcW w:type="dxa" w:w="1584"/>
+          </w:tcPr>
+          <w:p>
+            <w:r>
+              <w:rPr>
+                <w:sz w:val="12"/>
+              </w:rPr>
+              <w:t>ALIAS_ONLY / EXCLUDE_FROM_CONTROL_DENOMINATOR</w:t>
+            </w:r>
+          </w:p>
+        </w:tc>
+      </w:tr>
+      <w:tr>
+        <w:tc>
+          <w:tcPr>
+            <w:tcW w:type="dxa" w:w="1584"/>
+          </w:tcPr>
+          <w:p>
+            <w:r>
+              <w:rPr>
+                <w:sz w:val="12"/>
+              </w:rPr>
+              <w:t>CTRL-…PROJECT-PROGRESS-OVERVIEW-OPEN</w:t>
+            </w:r>
+          </w:p>
+        </w:tc>
+        <w:tc>
+          <w:tcPr>
+            <w:tcW w:type="dxa" w:w="1584"/>
+          </w:tcPr>
+          <w:p>
+            <w:r>
+              <w:rPr>
+                <w:sz w:val="12"/>
+              </w:rPr>
+              <w:t>CTRL-WORKSPACE-WB-01-PROJECT-PROGRESS-OVERVIEW-OPEN</w:t>
+            </w:r>
+          </w:p>
+        </w:tc>
+        <w:tc>
+          <w:tcPr>
+            <w:tcW w:type="dxa" w:w="1584"/>
+          </w:tcPr>
+          <w:p>
+            <w:r>
+              <w:rPr>
+                <w:sz w:val="12"/>
+              </w:rPr>
+              <w:t>01_ACPOS_Global_Intelligent_Brain_Information_Lifecycle_Mother_Basic_Logic_Design_Normative_Contract_v4.docx</w:t>
+            </w:r>
+          </w:p>
+        </w:tc>
+        <w:tc>
+          <w:tcPr>
+            <w:tcW w:type="dxa" w:w="1584"/>
+          </w:tcPr>
+          <w:p>
+            <w:r>
+              <w:rPr>
+                <w:sz w:val="12"/>
+              </w:rPr>
+              <w:t>table 26 / row 8</w:t>
+            </w:r>
+          </w:p>
+        </w:tc>
+        <w:tc>
+          <w:tcPr>
+            <w:tcW w:type="dxa" w:w="1584"/>
+          </w:tcPr>
+          <w:p>
+            <w:r>
+              <w:rPr>
+                <w:sz w:val="12"/>
+              </w:rPr>
+              <w:t>table 73 / row 13</w:t>
+            </w:r>
+          </w:p>
+        </w:tc>
+        <w:tc>
+          <w:tcPr>
+            <w:tcW w:type="dxa" w:w="1584"/>
+          </w:tcPr>
+          <w:p>
+            <w:r>
+              <w:rPr>
+                <w:sz w:val="12"/>
+              </w:rPr>
+              <w:t>PAGE_READ</w:t>
+            </w:r>
+          </w:p>
+        </w:tc>
+        <w:tc>
+          <w:tcPr>
+            <w:tcW w:type="dxa" w:w="1584"/>
+          </w:tcPr>
+          <w:p>
+            <w:r>
+              <w:rPr>
+                <w:sz w:val="12"/>
+              </w:rPr>
+              <w:t>ALIAS_ONLY / EXCLUDE_FROM_CONTROL_DENOMINATOR</w:t>
+            </w:r>
+          </w:p>
+        </w:tc>
+      </w:tr>
+      <w:tr>
+        <w:tc>
+          <w:tcPr>
+            <w:tcW w:type="dxa" w:w="1584"/>
+          </w:tcPr>
+          <w:p>
+            <w:r>
+              <w:rPr>
+                <w:sz w:val="12"/>
+              </w:rPr>
+              <w:t>CTRL-…RECENT-COMPLETIONS-OPEN</w:t>
+            </w:r>
+          </w:p>
+        </w:tc>
+        <w:tc>
+          <w:tcPr>
+            <w:tcW w:type="dxa" w:w="1584"/>
+          </w:tcPr>
+          <w:p>
+            <w:r>
+              <w:rPr>
+                <w:sz w:val="12"/>
+              </w:rPr>
+              <w:t>CTRL-WORKSPACE-WB-01-RECENT-COMPLETIONS-OPEN</w:t>
+            </w:r>
+          </w:p>
+        </w:tc>
+        <w:tc>
+          <w:tcPr>
+            <w:tcW w:type="dxa" w:w="1584"/>
+          </w:tcPr>
+          <w:p>
+            <w:r>
+              <w:rPr>
+                <w:sz w:val="12"/>
+              </w:rPr>
+              <w:t>01_ACPOS_Global_Intelligent_Brain_Information_Lifecycle_Mother_Basic_Logic_Design_Normative_Contract_v4.docx</w:t>
+            </w:r>
+          </w:p>
+        </w:tc>
+        <w:tc>
+          <w:tcPr>
+            <w:tcW w:type="dxa" w:w="1584"/>
+          </w:tcPr>
+          <w:p>
+            <w:r>
+              <w:rPr>
+                <w:sz w:val="12"/>
+              </w:rPr>
+              <w:t>table 26 / row 15</w:t>
+            </w:r>
+          </w:p>
+        </w:tc>
+        <w:tc>
+          <w:tcPr>
+            <w:tcW w:type="dxa" w:w="1584"/>
+          </w:tcPr>
+          <w:p>
+            <w:r>
+              <w:rPr>
+                <w:sz w:val="12"/>
+              </w:rPr>
+              <w:t>table 73 / row 14</w:t>
+            </w:r>
+          </w:p>
+        </w:tc>
+        <w:tc>
+          <w:tcPr>
+            <w:tcW w:type="dxa" w:w="1584"/>
+          </w:tcPr>
+          <w:p>
+            <w:r>
+              <w:rPr>
+                <w:sz w:val="12"/>
+              </w:rPr>
+              <w:t>PAGE_READ</w:t>
+            </w:r>
+          </w:p>
+        </w:tc>
+        <w:tc>
+          <w:tcPr>
+            <w:tcW w:type="dxa" w:w="1584"/>
+          </w:tcPr>
+          <w:p>
+            <w:r>
+              <w:rPr>
+                <w:sz w:val="12"/>
+              </w:rPr>
+              <w:t>ALIAS_ONLY / EXCLUDE_FROM_CONTROL_DENOMINATOR</w:t>
+            </w:r>
+          </w:p>
+        </w:tc>
+      </w:tr>
+      <w:tr>
+        <w:tc>
+          <w:tcPr>
+            <w:tcW w:type="dxa" w:w="1584"/>
+          </w:tcPr>
+          <w:p>
+            <w:r>
+              <w:rPr>
+                <w:sz w:val="12"/>
+              </w:rPr>
+              <w:t>CTRL-…SYSTEM-STATUS-SUMMARY-OPEN</w:t>
+            </w:r>
+          </w:p>
+        </w:tc>
+        <w:tc>
+          <w:tcPr>
+            <w:tcW w:type="dxa" w:w="1584"/>
+          </w:tcPr>
+          <w:p>
+            <w:r>
+              <w:rPr>
+                <w:sz w:val="12"/>
+              </w:rPr>
+              <w:t>CTRL-WORKSPACE-WB-01-SYSTEM-STATUS-SUMMARY-OPEN</w:t>
+            </w:r>
+          </w:p>
+        </w:tc>
+        <w:tc>
+          <w:tcPr>
+            <w:tcW w:type="dxa" w:w="1584"/>
+          </w:tcPr>
+          <w:p>
+            <w:r>
+              <w:rPr>
+                <w:sz w:val="12"/>
+              </w:rPr>
+              <w:t>01_ACPOS_Global_Intelligent_Brain_Information_Lifecycle_Mother_Basic_Logic_Design_Normative_Contract_v4.docx</w:t>
+            </w:r>
+          </w:p>
+        </w:tc>
+        <w:tc>
+          <w:tcPr>
+            <w:tcW w:type="dxa" w:w="1584"/>
+          </w:tcPr>
+          <w:p>
+            <w:r>
+              <w:rPr>
+                <w:sz w:val="12"/>
+              </w:rPr>
+              <w:t>table 26 / row 14</w:t>
+            </w:r>
+          </w:p>
+        </w:tc>
+        <w:tc>
+          <w:tcPr>
+            <w:tcW w:type="dxa" w:w="1584"/>
+          </w:tcPr>
+          <w:p>
+            <w:r>
+              <w:rPr>
+                <w:sz w:val="12"/>
+              </w:rPr>
+              <w:t>table 73 / row 15</w:t>
+            </w:r>
+          </w:p>
+        </w:tc>
+        <w:tc>
+          <w:tcPr>
+            <w:tcW w:type="dxa" w:w="1584"/>
+          </w:tcPr>
+          <w:p>
+            <w:r>
+              <w:rPr>
+                <w:sz w:val="12"/>
+              </w:rPr>
+              <w:t>PAGE_READ</w:t>
+            </w:r>
+          </w:p>
+        </w:tc>
+        <w:tc>
+          <w:tcPr>
+            <w:tcW w:type="dxa" w:w="1584"/>
+          </w:tcPr>
+          <w:p>
+            <w:r>
+              <w:rPr>
+                <w:sz w:val="12"/>
+              </w:rPr>
+              <w:t>ALIAS_ONLY / EXCLUDE_FROM_CONTROL_DENOMINATOR</w:t>
+            </w:r>
+          </w:p>
+        </w:tc>
+      </w:tr>
+    </w:tbl>
+    <w:p>
+      <w:r>
+        <w:t>Action UID remains '—' on the actual canonical product rows and is not remediated in Batch 11. Those canonical rows remain part of the separate unique-owner specification-remediation denominator.</w:t>
+      </w:r>
+    </w:p>
     <w:sectPr>
-      <w:pgSz w:w="15840" w:h="12240" w:orient="landscape"/>
-      <w:pgMar w:top="504" w:right="432" w:bottom="504" w:left="432" w:header="720" w:footer="720" w:gutter="0"/>
+      <w:pgSz w:w="12240" w:h="15840" w:orient="landscape"/>
+      <w:pgMar w:top="576" w:right="576" w:bottom="576" w:left="576" w:header="720" w:footer="720" w:gutter="0"/>
       <w:cols w:space="720"/>
       <w:docGrid w:linePitch="360"/>
     </w:sectPr>

</xml_diff>

<commit_message>
docs(acpos): tighten batch-11 render layout
</commit_message>
<xml_diff>
--- a/ACPOS_WB-01_MOTHER_BASIC_DESIGN_TECH_PURPLE_v1.0.docx
+++ b/ACPOS_WB-01_MOTHER_BASIC_DESIGN_TECH_PURPLE_v1.0.docx
@@ -28355,11 +28355,20 @@
         <w:tc>
           <w:tcPr>
             <w:tcW w:type="dxa" w:w="1584"/>
-          </w:tcPr>
-          <w:p>
-            <w:r>
-              <w:rPr>
-                <w:sz w:val="12"/>
+            <w:tcMar>
+              <w:top w:w="12" w:type="dxa"/>
+              <w:bottom w:w="12" w:type="dxa"/>
+              <w:left w:w="24" w:type="dxa"/>
+              <w:right w:w="24" w:type="dxa"/>
+            </w:tcMar>
+          </w:tcPr>
+          <w:p>
+            <w:pPr>
+              <w:spacing w:before="0" w:after="0" w:line="240" w:lineRule="auto"/>
+            </w:pPr>
+            <w:r>
+              <w:rPr>
+                <w:sz w:val="9"/>
               </w:rPr>
               <w:t>Compact Alias</w:t>
             </w:r>
@@ -28368,11 +28377,20 @@
         <w:tc>
           <w:tcPr>
             <w:tcW w:type="dxa" w:w="1584"/>
-          </w:tcPr>
-          <w:p>
-            <w:r>
-              <w:rPr>
-                <w:sz w:val="12"/>
+            <w:tcMar>
+              <w:top w:w="12" w:type="dxa"/>
+              <w:bottom w:w="12" w:type="dxa"/>
+              <w:left w:w="24" w:type="dxa"/>
+              <w:right w:w="24" w:type="dxa"/>
+            </w:tcMar>
+          </w:tcPr>
+          <w:p>
+            <w:pPr>
+              <w:spacing w:before="0" w:after="0" w:line="240" w:lineRule="auto"/>
+            </w:pPr>
+            <w:r>
+              <w:rPr>
+                <w:sz w:val="9"/>
               </w:rPr>
               <w:t>Canonical UID</w:t>
             </w:r>
@@ -28381,11 +28399,20 @@
         <w:tc>
           <w:tcPr>
             <w:tcW w:type="dxa" w:w="1584"/>
-          </w:tcPr>
-          <w:p>
-            <w:r>
-              <w:rPr>
-                <w:sz w:val="12"/>
+            <w:tcMar>
+              <w:top w:w="12" w:type="dxa"/>
+              <w:bottom w:w="12" w:type="dxa"/>
+              <w:left w:w="24" w:type="dxa"/>
+              <w:right w:w="24" w:type="dxa"/>
+            </w:tcMar>
+          </w:tcPr>
+          <w:p>
+            <w:pPr>
+              <w:spacing w:before="0" w:after="0" w:line="240" w:lineRule="auto"/>
+            </w:pPr>
+            <w:r>
+              <w:rPr>
+                <w:sz w:val="9"/>
               </w:rPr>
               <w:t>Canonical Owner</w:t>
             </w:r>
@@ -28394,11 +28421,20 @@
         <w:tc>
           <w:tcPr>
             <w:tcW w:type="dxa" w:w="1584"/>
-          </w:tcPr>
-          <w:p>
-            <w:r>
-              <w:rPr>
-                <w:sz w:val="12"/>
+            <w:tcMar>
+              <w:top w:w="12" w:type="dxa"/>
+              <w:bottom w:w="12" w:type="dxa"/>
+              <w:left w:w="24" w:type="dxa"/>
+              <w:right w:w="24" w:type="dxa"/>
+            </w:tcMar>
+          </w:tcPr>
+          <w:p>
+            <w:pPr>
+              <w:spacing w:before="0" w:after="0" w:line="240" w:lineRule="auto"/>
+            </w:pPr>
+            <w:r>
+              <w:rPr>
+                <w:sz w:val="9"/>
               </w:rPr>
               <w:t>WB Registry</w:t>
             </w:r>
@@ -28407,11 +28443,20 @@
         <w:tc>
           <w:tcPr>
             <w:tcW w:type="dxa" w:w="1584"/>
-          </w:tcPr>
-          <w:p>
-            <w:r>
-              <w:rPr>
-                <w:sz w:val="12"/>
+            <w:tcMar>
+              <w:top w:w="12" w:type="dxa"/>
+              <w:bottom w:w="12" w:type="dxa"/>
+              <w:left w:w="24" w:type="dxa"/>
+              <w:right w:w="24" w:type="dxa"/>
+            </w:tcMar>
+          </w:tcPr>
+          <w:p>
+            <w:pPr>
+              <w:spacing w:before="0" w:after="0" w:line="240" w:lineRule="auto"/>
+            </w:pPr>
+            <w:r>
+              <w:rPr>
+                <w:sz w:val="9"/>
               </w:rPr>
               <w:t>System 01 Registry</w:t>
             </w:r>
@@ -28420,11 +28465,20 @@
         <w:tc>
           <w:tcPr>
             <w:tcW w:type="dxa" w:w="1584"/>
-          </w:tcPr>
-          <w:p>
-            <w:r>
-              <w:rPr>
-                <w:sz w:val="12"/>
+            <w:tcMar>
+              <w:top w:w="12" w:type="dxa"/>
+              <w:bottom w:w="12" w:type="dxa"/>
+              <w:left w:w="24" w:type="dxa"/>
+              <w:right w:w="24" w:type="dxa"/>
+            </w:tcMar>
+          </w:tcPr>
+          <w:p>
+            <w:pPr>
+              <w:spacing w:before="0" w:after="0" w:line="240" w:lineRule="auto"/>
+            </w:pPr>
+            <w:r>
+              <w:rPr>
+                <w:sz w:val="9"/>
               </w:rPr>
               <w:t>Existing Gate</w:t>
             </w:r>
@@ -28433,11 +28487,20 @@
         <w:tc>
           <w:tcPr>
             <w:tcW w:type="dxa" w:w="1584"/>
-          </w:tcPr>
-          <w:p>
-            <w:r>
-              <w:rPr>
-                <w:sz w:val="12"/>
+            <w:tcMar>
+              <w:top w:w="12" w:type="dxa"/>
+              <w:bottom w:w="12" w:type="dxa"/>
+              <w:left w:w="24" w:type="dxa"/>
+              <w:right w:w="24" w:type="dxa"/>
+            </w:tcMar>
+          </w:tcPr>
+          <w:p>
+            <w:pPr>
+              <w:spacing w:before="0" w:after="0" w:line="240" w:lineRule="auto"/>
+            </w:pPr>
+            <w:r>
+              <w:rPr>
+                <w:sz w:val="9"/>
               </w:rPr>
               <w:t>Disposition</w:t>
             </w:r>
@@ -28448,11 +28511,20 @@
         <w:tc>
           <w:tcPr>
             <w:tcW w:type="dxa" w:w="1584"/>
-          </w:tcPr>
-          <w:p>
-            <w:r>
-              <w:rPr>
-                <w:sz w:val="12"/>
+            <w:tcMar>
+              <w:top w:w="12" w:type="dxa"/>
+              <w:bottom w:w="12" w:type="dxa"/>
+              <w:left w:w="24" w:type="dxa"/>
+              <w:right w:w="24" w:type="dxa"/>
+            </w:tcMar>
+          </w:tcPr>
+          <w:p>
+            <w:pPr>
+              <w:spacing w:before="0" w:after="0" w:line="240" w:lineRule="auto"/>
+            </w:pPr>
+            <w:r>
+              <w:rPr>
+                <w:sz w:val="9"/>
               </w:rPr>
               <w:t>CTRL-…COMPANY-ANNOUNCEMENTS-OPEN</w:t>
             </w:r>
@@ -28461,11 +28533,20 @@
         <w:tc>
           <w:tcPr>
             <w:tcW w:type="dxa" w:w="1584"/>
-          </w:tcPr>
-          <w:p>
-            <w:r>
-              <w:rPr>
-                <w:sz w:val="12"/>
+            <w:tcMar>
+              <w:top w:w="12" w:type="dxa"/>
+              <w:bottom w:w="12" w:type="dxa"/>
+              <w:left w:w="24" w:type="dxa"/>
+              <w:right w:w="24" w:type="dxa"/>
+            </w:tcMar>
+          </w:tcPr>
+          <w:p>
+            <w:pPr>
+              <w:spacing w:before="0" w:after="0" w:line="240" w:lineRule="auto"/>
+            </w:pPr>
+            <w:r>
+              <w:rPr>
+                <w:sz w:val="9"/>
               </w:rPr>
               <w:t>CTRL-WORKSPACE-WB-01-COMPANY-ANNOUNCEMENTS-OPEN</w:t>
             </w:r>
@@ -28474,11 +28555,20 @@
         <w:tc>
           <w:tcPr>
             <w:tcW w:type="dxa" w:w="1584"/>
-          </w:tcPr>
-          <w:p>
-            <w:r>
-              <w:rPr>
-                <w:sz w:val="12"/>
+            <w:tcMar>
+              <w:top w:w="12" w:type="dxa"/>
+              <w:bottom w:w="12" w:type="dxa"/>
+              <w:left w:w="24" w:type="dxa"/>
+              <w:right w:w="24" w:type="dxa"/>
+            </w:tcMar>
+          </w:tcPr>
+          <w:p>
+            <w:pPr>
+              <w:spacing w:before="0" w:after="0" w:line="240" w:lineRule="auto"/>
+            </w:pPr>
+            <w:r>
+              <w:rPr>
+                <w:sz w:val="9"/>
               </w:rPr>
               <w:t>01_ACPOS_Global_Intelligent_Brain_Information_Lifecycle_Mother_Basic_Logic_Design_Normative_Contract_v4.docx</w:t>
             </w:r>
@@ -28487,11 +28577,20 @@
         <w:tc>
           <w:tcPr>
             <w:tcW w:type="dxa" w:w="1584"/>
-          </w:tcPr>
-          <w:p>
-            <w:r>
-              <w:rPr>
-                <w:sz w:val="12"/>
+            <w:tcMar>
+              <w:top w:w="12" w:type="dxa"/>
+              <w:bottom w:w="12" w:type="dxa"/>
+              <w:left w:w="24" w:type="dxa"/>
+              <w:right w:w="24" w:type="dxa"/>
+            </w:tcMar>
+          </w:tcPr>
+          <w:p>
+            <w:pPr>
+              <w:spacing w:before="0" w:after="0" w:line="240" w:lineRule="auto"/>
+            </w:pPr>
+            <w:r>
+              <w:rPr>
+                <w:sz w:val="9"/>
               </w:rPr>
               <w:t>table 26 / row 12</w:t>
             </w:r>
@@ -28500,11 +28599,20 @@
         <w:tc>
           <w:tcPr>
             <w:tcW w:type="dxa" w:w="1584"/>
-          </w:tcPr>
-          <w:p>
-            <w:r>
-              <w:rPr>
-                <w:sz w:val="12"/>
+            <w:tcMar>
+              <w:top w:w="12" w:type="dxa"/>
+              <w:bottom w:w="12" w:type="dxa"/>
+              <w:left w:w="24" w:type="dxa"/>
+              <w:right w:w="24" w:type="dxa"/>
+            </w:tcMar>
+          </w:tcPr>
+          <w:p>
+            <w:pPr>
+              <w:spacing w:before="0" w:after="0" w:line="240" w:lineRule="auto"/>
+            </w:pPr>
+            <w:r>
+              <w:rPr>
+                <w:sz w:val="9"/>
               </w:rPr>
               <w:t>table 73 / row 2</w:t>
             </w:r>
@@ -28513,11 +28621,20 @@
         <w:tc>
           <w:tcPr>
             <w:tcW w:type="dxa" w:w="1584"/>
-          </w:tcPr>
-          <w:p>
-            <w:r>
-              <w:rPr>
-                <w:sz w:val="12"/>
+            <w:tcMar>
+              <w:top w:w="12" w:type="dxa"/>
+              <w:bottom w:w="12" w:type="dxa"/>
+              <w:left w:w="24" w:type="dxa"/>
+              <w:right w:w="24" w:type="dxa"/>
+            </w:tcMar>
+          </w:tcPr>
+          <w:p>
+            <w:pPr>
+              <w:spacing w:before="0" w:after="0" w:line="240" w:lineRule="auto"/>
+            </w:pPr>
+            <w:r>
+              <w:rPr>
+                <w:sz w:val="9"/>
               </w:rPr>
               <w:t>PAGE_READ</w:t>
             </w:r>
@@ -28526,11 +28643,20 @@
         <w:tc>
           <w:tcPr>
             <w:tcW w:type="dxa" w:w="1584"/>
-          </w:tcPr>
-          <w:p>
-            <w:r>
-              <w:rPr>
-                <w:sz w:val="12"/>
+            <w:tcMar>
+              <w:top w:w="12" w:type="dxa"/>
+              <w:bottom w:w="12" w:type="dxa"/>
+              <w:left w:w="24" w:type="dxa"/>
+              <w:right w:w="24" w:type="dxa"/>
+            </w:tcMar>
+          </w:tcPr>
+          <w:p>
+            <w:pPr>
+              <w:spacing w:before="0" w:after="0" w:line="240" w:lineRule="auto"/>
+            </w:pPr>
+            <w:r>
+              <w:rPr>
+                <w:sz w:val="9"/>
               </w:rPr>
               <w:t>ALIAS_ONLY / EXCLUDE_FROM_CONTROL_DENOMINATOR</w:t>
             </w:r>
@@ -28541,11 +28667,20 @@
         <w:tc>
           <w:tcPr>
             <w:tcW w:type="dxa" w:w="1584"/>
-          </w:tcPr>
-          <w:p>
-            <w:r>
-              <w:rPr>
-                <w:sz w:val="12"/>
+            <w:tcMar>
+              <w:top w:w="12" w:type="dxa"/>
+              <w:bottom w:w="12" w:type="dxa"/>
+              <w:left w:w="24" w:type="dxa"/>
+              <w:right w:w="24" w:type="dxa"/>
+            </w:tcMar>
+          </w:tcPr>
+          <w:p>
+            <w:pPr>
+              <w:spacing w:before="0" w:after="0" w:line="240" w:lineRule="auto"/>
+            </w:pPr>
+            <w:r>
+              <w:rPr>
+                <w:sz w:val="9"/>
               </w:rPr>
               <w:t>CTRL-…COMPANY-AVERAGE-PROGRESS-OPEN</w:t>
             </w:r>
@@ -28554,11 +28689,20 @@
         <w:tc>
           <w:tcPr>
             <w:tcW w:type="dxa" w:w="1584"/>
-          </w:tcPr>
-          <w:p>
-            <w:r>
-              <w:rPr>
-                <w:sz w:val="12"/>
+            <w:tcMar>
+              <w:top w:w="12" w:type="dxa"/>
+              <w:bottom w:w="12" w:type="dxa"/>
+              <w:left w:w="24" w:type="dxa"/>
+              <w:right w:w="24" w:type="dxa"/>
+            </w:tcMar>
+          </w:tcPr>
+          <w:p>
+            <w:pPr>
+              <w:spacing w:before="0" w:after="0" w:line="240" w:lineRule="auto"/>
+            </w:pPr>
+            <w:r>
+              <w:rPr>
+                <w:sz w:val="9"/>
               </w:rPr>
               <w:t>CTRL-WORKSPACE-WB-01-COMPANY-AVERAGE-PROGRESS-OPEN</w:t>
             </w:r>
@@ -28567,11 +28711,20 @@
         <w:tc>
           <w:tcPr>
             <w:tcW w:type="dxa" w:w="1584"/>
-          </w:tcPr>
-          <w:p>
-            <w:r>
-              <w:rPr>
-                <w:sz w:val="12"/>
+            <w:tcMar>
+              <w:top w:w="12" w:type="dxa"/>
+              <w:bottom w:w="12" w:type="dxa"/>
+              <w:left w:w="24" w:type="dxa"/>
+              <w:right w:w="24" w:type="dxa"/>
+            </w:tcMar>
+          </w:tcPr>
+          <w:p>
+            <w:pPr>
+              <w:spacing w:before="0" w:after="0" w:line="240" w:lineRule="auto"/>
+            </w:pPr>
+            <w:r>
+              <w:rPr>
+                <w:sz w:val="9"/>
               </w:rPr>
               <w:t>01_ACPOS_Global_Intelligent_Brain_Information_Lifecycle_Mother_Basic_Logic_Design_Normative_Contract_v4.docx</w:t>
             </w:r>
@@ -28580,11 +28733,20 @@
         <w:tc>
           <w:tcPr>
             <w:tcW w:type="dxa" w:w="1584"/>
-          </w:tcPr>
-          <w:p>
-            <w:r>
-              <w:rPr>
-                <w:sz w:val="12"/>
+            <w:tcMar>
+              <w:top w:w="12" w:type="dxa"/>
+              <w:bottom w:w="12" w:type="dxa"/>
+              <w:left w:w="24" w:type="dxa"/>
+              <w:right w:w="24" w:type="dxa"/>
+            </w:tcMar>
+          </w:tcPr>
+          <w:p>
+            <w:pPr>
+              <w:spacing w:before="0" w:after="0" w:line="240" w:lineRule="auto"/>
+            </w:pPr>
+            <w:r>
+              <w:rPr>
+                <w:sz w:val="9"/>
               </w:rPr>
               <w:t>table 26 / row 7</w:t>
             </w:r>
@@ -28593,11 +28755,20 @@
         <w:tc>
           <w:tcPr>
             <w:tcW w:type="dxa" w:w="1584"/>
-          </w:tcPr>
-          <w:p>
-            <w:r>
-              <w:rPr>
-                <w:sz w:val="12"/>
+            <w:tcMar>
+              <w:top w:w="12" w:type="dxa"/>
+              <w:bottom w:w="12" w:type="dxa"/>
+              <w:left w:w="24" w:type="dxa"/>
+              <w:right w:w="24" w:type="dxa"/>
+            </w:tcMar>
+          </w:tcPr>
+          <w:p>
+            <w:pPr>
+              <w:spacing w:before="0" w:after="0" w:line="240" w:lineRule="auto"/>
+            </w:pPr>
+            <w:r>
+              <w:rPr>
+                <w:sz w:val="9"/>
               </w:rPr>
               <w:t>table 73 / row 3</w:t>
             </w:r>
@@ -28606,11 +28777,20 @@
         <w:tc>
           <w:tcPr>
             <w:tcW w:type="dxa" w:w="1584"/>
-          </w:tcPr>
-          <w:p>
-            <w:r>
-              <w:rPr>
-                <w:sz w:val="12"/>
+            <w:tcMar>
+              <w:top w:w="12" w:type="dxa"/>
+              <w:bottom w:w="12" w:type="dxa"/>
+              <w:left w:w="24" w:type="dxa"/>
+              <w:right w:w="24" w:type="dxa"/>
+            </w:tcMar>
+          </w:tcPr>
+          <w:p>
+            <w:pPr>
+              <w:spacing w:before="0" w:after="0" w:line="240" w:lineRule="auto"/>
+            </w:pPr>
+            <w:r>
+              <w:rPr>
+                <w:sz w:val="9"/>
               </w:rPr>
               <w:t>PAGE_READ</w:t>
             </w:r>
@@ -28619,11 +28799,20 @@
         <w:tc>
           <w:tcPr>
             <w:tcW w:type="dxa" w:w="1584"/>
-          </w:tcPr>
-          <w:p>
-            <w:r>
-              <w:rPr>
-                <w:sz w:val="12"/>
+            <w:tcMar>
+              <w:top w:w="12" w:type="dxa"/>
+              <w:bottom w:w="12" w:type="dxa"/>
+              <w:left w:w="24" w:type="dxa"/>
+              <w:right w:w="24" w:type="dxa"/>
+            </w:tcMar>
+          </w:tcPr>
+          <w:p>
+            <w:pPr>
+              <w:spacing w:before="0" w:after="0" w:line="240" w:lineRule="auto"/>
+            </w:pPr>
+            <w:r>
+              <w:rPr>
+                <w:sz w:val="9"/>
               </w:rPr>
               <w:t>ALIAS_ONLY / EXCLUDE_FROM_CONTROL_DENOMINATOR</w:t>
             </w:r>
@@ -28634,11 +28823,20 @@
         <w:tc>
           <w:tcPr>
             <w:tcW w:type="dxa" w:w="1584"/>
-          </w:tcPr>
-          <w:p>
-            <w:r>
-              <w:rPr>
-                <w:sz w:val="12"/>
+            <w:tcMar>
+              <w:top w:w="12" w:type="dxa"/>
+              <w:bottom w:w="12" w:type="dxa"/>
+              <w:left w:w="24" w:type="dxa"/>
+              <w:right w:w="24" w:type="dxa"/>
+            </w:tcMar>
+          </w:tcPr>
+          <w:p>
+            <w:pPr>
+              <w:spacing w:before="0" w:after="0" w:line="240" w:lineRule="auto"/>
+            </w:pPr>
+            <w:r>
+              <w:rPr>
+                <w:sz w:val="9"/>
               </w:rPr>
               <w:t>CTRL-…COMPANY-COMPLETED-PROJECT-COUNT-OPEN</w:t>
             </w:r>
@@ -28647,11 +28845,20 @@
         <w:tc>
           <w:tcPr>
             <w:tcW w:type="dxa" w:w="1584"/>
-          </w:tcPr>
-          <w:p>
-            <w:r>
-              <w:rPr>
-                <w:sz w:val="12"/>
+            <w:tcMar>
+              <w:top w:w="12" w:type="dxa"/>
+              <w:bottom w:w="12" w:type="dxa"/>
+              <w:left w:w="24" w:type="dxa"/>
+              <w:right w:w="24" w:type="dxa"/>
+            </w:tcMar>
+          </w:tcPr>
+          <w:p>
+            <w:pPr>
+              <w:spacing w:before="0" w:after="0" w:line="240" w:lineRule="auto"/>
+            </w:pPr>
+            <w:r>
+              <w:rPr>
+                <w:sz w:val="9"/>
               </w:rPr>
               <w:t>CTRL-WORKSPACE-WB-01-COMPANY-COMPLETED-PROJECT-COUNT-OPEN</w:t>
             </w:r>
@@ -28660,11 +28867,20 @@
         <w:tc>
           <w:tcPr>
             <w:tcW w:type="dxa" w:w="1584"/>
-          </w:tcPr>
-          <w:p>
-            <w:r>
-              <w:rPr>
-                <w:sz w:val="12"/>
+            <w:tcMar>
+              <w:top w:w="12" w:type="dxa"/>
+              <w:bottom w:w="12" w:type="dxa"/>
+              <w:left w:w="24" w:type="dxa"/>
+              <w:right w:w="24" w:type="dxa"/>
+            </w:tcMar>
+          </w:tcPr>
+          <w:p>
+            <w:pPr>
+              <w:spacing w:before="0" w:after="0" w:line="240" w:lineRule="auto"/>
+            </w:pPr>
+            <w:r>
+              <w:rPr>
+                <w:sz w:val="9"/>
               </w:rPr>
               <w:t>01_ACPOS_Global_Intelligent_Brain_Information_Lifecycle_Mother_Basic_Logic_Design_Normative_Contract_v4.docx</w:t>
             </w:r>
@@ -28673,11 +28889,20 @@
         <w:tc>
           <w:tcPr>
             <w:tcW w:type="dxa" w:w="1584"/>
-          </w:tcPr>
-          <w:p>
-            <w:r>
-              <w:rPr>
-                <w:sz w:val="12"/>
+            <w:tcMar>
+              <w:top w:w="12" w:type="dxa"/>
+              <w:bottom w:w="12" w:type="dxa"/>
+              <w:left w:w="24" w:type="dxa"/>
+              <w:right w:w="24" w:type="dxa"/>
+            </w:tcMar>
+          </w:tcPr>
+          <w:p>
+            <w:pPr>
+              <w:spacing w:before="0" w:after="0" w:line="240" w:lineRule="auto"/>
+            </w:pPr>
+            <w:r>
+              <w:rPr>
+                <w:sz w:val="9"/>
               </w:rPr>
               <w:t>table 26 / row 6</w:t>
             </w:r>
@@ -28686,11 +28911,20 @@
         <w:tc>
           <w:tcPr>
             <w:tcW w:type="dxa" w:w="1584"/>
-          </w:tcPr>
-          <w:p>
-            <w:r>
-              <w:rPr>
-                <w:sz w:val="12"/>
+            <w:tcMar>
+              <w:top w:w="12" w:type="dxa"/>
+              <w:bottom w:w="12" w:type="dxa"/>
+              <w:left w:w="24" w:type="dxa"/>
+              <w:right w:w="24" w:type="dxa"/>
+            </w:tcMar>
+          </w:tcPr>
+          <w:p>
+            <w:pPr>
+              <w:spacing w:before="0" w:after="0" w:line="240" w:lineRule="auto"/>
+            </w:pPr>
+            <w:r>
+              <w:rPr>
+                <w:sz w:val="9"/>
               </w:rPr>
               <w:t>table 73 / row 4</w:t>
             </w:r>
@@ -28699,11 +28933,20 @@
         <w:tc>
           <w:tcPr>
             <w:tcW w:type="dxa" w:w="1584"/>
-          </w:tcPr>
-          <w:p>
-            <w:r>
-              <w:rPr>
-                <w:sz w:val="12"/>
+            <w:tcMar>
+              <w:top w:w="12" w:type="dxa"/>
+              <w:bottom w:w="12" w:type="dxa"/>
+              <w:left w:w="24" w:type="dxa"/>
+              <w:right w:w="24" w:type="dxa"/>
+            </w:tcMar>
+          </w:tcPr>
+          <w:p>
+            <w:pPr>
+              <w:spacing w:before="0" w:after="0" w:line="240" w:lineRule="auto"/>
+            </w:pPr>
+            <w:r>
+              <w:rPr>
+                <w:sz w:val="9"/>
               </w:rPr>
               <w:t>PAGE_READ</w:t>
             </w:r>
@@ -28712,11 +28955,20 @@
         <w:tc>
           <w:tcPr>
             <w:tcW w:type="dxa" w:w="1584"/>
-          </w:tcPr>
-          <w:p>
-            <w:r>
-              <w:rPr>
-                <w:sz w:val="12"/>
+            <w:tcMar>
+              <w:top w:w="12" w:type="dxa"/>
+              <w:bottom w:w="12" w:type="dxa"/>
+              <w:left w:w="24" w:type="dxa"/>
+              <w:right w:w="24" w:type="dxa"/>
+            </w:tcMar>
+          </w:tcPr>
+          <w:p>
+            <w:pPr>
+              <w:spacing w:before="0" w:after="0" w:line="240" w:lineRule="auto"/>
+            </w:pPr>
+            <w:r>
+              <w:rPr>
+                <w:sz w:val="9"/>
               </w:rPr>
               <w:t>ALIAS_ONLY / EXCLUDE_FROM_CONTROL_DENOMINATOR</w:t>
             </w:r>
@@ -28727,11 +28979,20 @@
         <w:tc>
           <w:tcPr>
             <w:tcW w:type="dxa" w:w="1584"/>
-          </w:tcPr>
-          <w:p>
-            <w:r>
-              <w:rPr>
-                <w:sz w:val="12"/>
+            <w:tcMar>
+              <w:top w:w="12" w:type="dxa"/>
+              <w:bottom w:w="12" w:type="dxa"/>
+              <w:left w:w="24" w:type="dxa"/>
+              <w:right w:w="24" w:type="dxa"/>
+            </w:tcMar>
+          </w:tcPr>
+          <w:p>
+            <w:pPr>
+              <w:spacing w:before="0" w:after="0" w:line="240" w:lineRule="auto"/>
+            </w:pPr>
+            <w:r>
+              <w:rPr>
+                <w:sz w:val="9"/>
               </w:rPr>
               <w:t>CTRL-…COMPANY-PENDING-ACTION-COUNT-OPEN</w:t>
             </w:r>
@@ -28740,11 +29001,20 @@
         <w:tc>
           <w:tcPr>
             <w:tcW w:type="dxa" w:w="1584"/>
-          </w:tcPr>
-          <w:p>
-            <w:r>
-              <w:rPr>
-                <w:sz w:val="12"/>
+            <w:tcMar>
+              <w:top w:w="12" w:type="dxa"/>
+              <w:bottom w:w="12" w:type="dxa"/>
+              <w:left w:w="24" w:type="dxa"/>
+              <w:right w:w="24" w:type="dxa"/>
+            </w:tcMar>
+          </w:tcPr>
+          <w:p>
+            <w:pPr>
+              <w:spacing w:before="0" w:after="0" w:line="240" w:lineRule="auto"/>
+            </w:pPr>
+            <w:r>
+              <w:rPr>
+                <w:sz w:val="9"/>
               </w:rPr>
               <w:t>CTRL-WORKSPACE-WB-01-COMPANY-PENDING-ACTION-COUNT-OPEN</w:t>
             </w:r>
@@ -28753,11 +29023,20 @@
         <w:tc>
           <w:tcPr>
             <w:tcW w:type="dxa" w:w="1584"/>
-          </w:tcPr>
-          <w:p>
-            <w:r>
-              <w:rPr>
-                <w:sz w:val="12"/>
+            <w:tcMar>
+              <w:top w:w="12" w:type="dxa"/>
+              <w:bottom w:w="12" w:type="dxa"/>
+              <w:left w:w="24" w:type="dxa"/>
+              <w:right w:w="24" w:type="dxa"/>
+            </w:tcMar>
+          </w:tcPr>
+          <w:p>
+            <w:pPr>
+              <w:spacing w:before="0" w:after="0" w:line="240" w:lineRule="auto"/>
+            </w:pPr>
+            <w:r>
+              <w:rPr>
+                <w:sz w:val="9"/>
               </w:rPr>
               <w:t>01_ACPOS_Global_Intelligent_Brain_Information_Lifecycle_Mother_Basic_Logic_Design_Normative_Contract_v4.docx</w:t>
             </w:r>
@@ -28766,11 +29045,20 @@
         <w:tc>
           <w:tcPr>
             <w:tcW w:type="dxa" w:w="1584"/>
-          </w:tcPr>
-          <w:p>
-            <w:r>
-              <w:rPr>
-                <w:sz w:val="12"/>
+            <w:tcMar>
+              <w:top w:w="12" w:type="dxa"/>
+              <w:bottom w:w="12" w:type="dxa"/>
+              <w:left w:w="24" w:type="dxa"/>
+              <w:right w:w="24" w:type="dxa"/>
+            </w:tcMar>
+          </w:tcPr>
+          <w:p>
+            <w:pPr>
+              <w:spacing w:before="0" w:after="0" w:line="240" w:lineRule="auto"/>
+            </w:pPr>
+            <w:r>
+              <w:rPr>
+                <w:sz w:val="9"/>
               </w:rPr>
               <w:t>table 26 / row 4</w:t>
             </w:r>
@@ -28779,11 +29067,20 @@
         <w:tc>
           <w:tcPr>
             <w:tcW w:type="dxa" w:w="1584"/>
-          </w:tcPr>
-          <w:p>
-            <w:r>
-              <w:rPr>
-                <w:sz w:val="12"/>
+            <w:tcMar>
+              <w:top w:w="12" w:type="dxa"/>
+              <w:bottom w:w="12" w:type="dxa"/>
+              <w:left w:w="24" w:type="dxa"/>
+              <w:right w:w="24" w:type="dxa"/>
+            </w:tcMar>
+          </w:tcPr>
+          <w:p>
+            <w:pPr>
+              <w:spacing w:before="0" w:after="0" w:line="240" w:lineRule="auto"/>
+            </w:pPr>
+            <w:r>
+              <w:rPr>
+                <w:sz w:val="9"/>
               </w:rPr>
               <w:t>table 73 / row 5</w:t>
             </w:r>
@@ -28792,11 +29089,20 @@
         <w:tc>
           <w:tcPr>
             <w:tcW w:type="dxa" w:w="1584"/>
-          </w:tcPr>
-          <w:p>
-            <w:r>
-              <w:rPr>
-                <w:sz w:val="12"/>
+            <w:tcMar>
+              <w:top w:w="12" w:type="dxa"/>
+              <w:bottom w:w="12" w:type="dxa"/>
+              <w:left w:w="24" w:type="dxa"/>
+              <w:right w:w="24" w:type="dxa"/>
+            </w:tcMar>
+          </w:tcPr>
+          <w:p>
+            <w:pPr>
+              <w:spacing w:before="0" w:after="0" w:line="240" w:lineRule="auto"/>
+            </w:pPr>
+            <w:r>
+              <w:rPr>
+                <w:sz w:val="9"/>
               </w:rPr>
               <w:t>PAGE_READ</w:t>
             </w:r>
@@ -28805,11 +29111,20 @@
         <w:tc>
           <w:tcPr>
             <w:tcW w:type="dxa" w:w="1584"/>
-          </w:tcPr>
-          <w:p>
-            <w:r>
-              <w:rPr>
-                <w:sz w:val="12"/>
+            <w:tcMar>
+              <w:top w:w="12" w:type="dxa"/>
+              <w:bottom w:w="12" w:type="dxa"/>
+              <w:left w:w="24" w:type="dxa"/>
+              <w:right w:w="24" w:type="dxa"/>
+            </w:tcMar>
+          </w:tcPr>
+          <w:p>
+            <w:pPr>
+              <w:spacing w:before="0" w:after="0" w:line="240" w:lineRule="auto"/>
+            </w:pPr>
+            <w:r>
+              <w:rPr>
+                <w:sz w:val="9"/>
               </w:rPr>
               <w:t>ALIAS_ONLY / EXCLUDE_FROM_CONTROL_DENOMINATOR</w:t>
             </w:r>
@@ -28820,11 +29135,20 @@
         <w:tc>
           <w:tcPr>
             <w:tcW w:type="dxa" w:w="1584"/>
-          </w:tcPr>
-          <w:p>
-            <w:r>
-              <w:rPr>
-                <w:sz w:val="12"/>
+            <w:tcMar>
+              <w:top w:w="12" w:type="dxa"/>
+              <w:bottom w:w="12" w:type="dxa"/>
+              <w:left w:w="24" w:type="dxa"/>
+              <w:right w:w="24" w:type="dxa"/>
+            </w:tcMar>
+          </w:tcPr>
+          <w:p>
+            <w:pPr>
+              <w:spacing w:before="0" w:after="0" w:line="240" w:lineRule="auto"/>
+            </w:pPr>
+            <w:r>
+              <w:rPr>
+                <w:sz w:val="9"/>
               </w:rPr>
               <w:t>CTRL-…COMPANY-PENDING-REVIEW-COUNT-OPEN</w:t>
             </w:r>
@@ -28833,11 +29157,20 @@
         <w:tc>
           <w:tcPr>
             <w:tcW w:type="dxa" w:w="1584"/>
-          </w:tcPr>
-          <w:p>
-            <w:r>
-              <w:rPr>
-                <w:sz w:val="12"/>
+            <w:tcMar>
+              <w:top w:w="12" w:type="dxa"/>
+              <w:bottom w:w="12" w:type="dxa"/>
+              <w:left w:w="24" w:type="dxa"/>
+              <w:right w:w="24" w:type="dxa"/>
+            </w:tcMar>
+          </w:tcPr>
+          <w:p>
+            <w:pPr>
+              <w:spacing w:before="0" w:after="0" w:line="240" w:lineRule="auto"/>
+            </w:pPr>
+            <w:r>
+              <w:rPr>
+                <w:sz w:val="9"/>
               </w:rPr>
               <w:t>CTRL-WORKSPACE-WB-01-COMPANY-PENDING-REVIEW-COUNT-OPEN</w:t>
             </w:r>
@@ -28846,11 +29179,20 @@
         <w:tc>
           <w:tcPr>
             <w:tcW w:type="dxa" w:w="1584"/>
-          </w:tcPr>
-          <w:p>
-            <w:r>
-              <w:rPr>
-                <w:sz w:val="12"/>
+            <w:tcMar>
+              <w:top w:w="12" w:type="dxa"/>
+              <w:bottom w:w="12" w:type="dxa"/>
+              <w:left w:w="24" w:type="dxa"/>
+              <w:right w:w="24" w:type="dxa"/>
+            </w:tcMar>
+          </w:tcPr>
+          <w:p>
+            <w:pPr>
+              <w:spacing w:before="0" w:after="0" w:line="240" w:lineRule="auto"/>
+            </w:pPr>
+            <w:r>
+              <w:rPr>
+                <w:sz w:val="9"/>
               </w:rPr>
               <w:t>01_ACPOS_Global_Intelligent_Brain_Information_Lifecycle_Mother_Basic_Logic_Design_Normative_Contract_v4.docx</w:t>
             </w:r>
@@ -28859,11 +29201,20 @@
         <w:tc>
           <w:tcPr>
             <w:tcW w:type="dxa" w:w="1584"/>
-          </w:tcPr>
-          <w:p>
-            <w:r>
-              <w:rPr>
-                <w:sz w:val="12"/>
+            <w:tcMar>
+              <w:top w:w="12" w:type="dxa"/>
+              <w:bottom w:w="12" w:type="dxa"/>
+              <w:left w:w="24" w:type="dxa"/>
+              <w:right w:w="24" w:type="dxa"/>
+            </w:tcMar>
+          </w:tcPr>
+          <w:p>
+            <w:pPr>
+              <w:spacing w:before="0" w:after="0" w:line="240" w:lineRule="auto"/>
+            </w:pPr>
+            <w:r>
+              <w:rPr>
+                <w:sz w:val="9"/>
               </w:rPr>
               <w:t>table 26 / row 5</w:t>
             </w:r>
@@ -28872,11 +29223,20 @@
         <w:tc>
           <w:tcPr>
             <w:tcW w:type="dxa" w:w="1584"/>
-          </w:tcPr>
-          <w:p>
-            <w:r>
-              <w:rPr>
-                <w:sz w:val="12"/>
+            <w:tcMar>
+              <w:top w:w="12" w:type="dxa"/>
+              <w:bottom w:w="12" w:type="dxa"/>
+              <w:left w:w="24" w:type="dxa"/>
+              <w:right w:w="24" w:type="dxa"/>
+            </w:tcMar>
+          </w:tcPr>
+          <w:p>
+            <w:pPr>
+              <w:spacing w:before="0" w:after="0" w:line="240" w:lineRule="auto"/>
+            </w:pPr>
+            <w:r>
+              <w:rPr>
+                <w:sz w:val="9"/>
               </w:rPr>
               <w:t>table 73 / row 6</w:t>
             </w:r>
@@ -28885,11 +29245,20 @@
         <w:tc>
           <w:tcPr>
             <w:tcW w:type="dxa" w:w="1584"/>
-          </w:tcPr>
-          <w:p>
-            <w:r>
-              <w:rPr>
-                <w:sz w:val="12"/>
+            <w:tcMar>
+              <w:top w:w="12" w:type="dxa"/>
+              <w:bottom w:w="12" w:type="dxa"/>
+              <w:left w:w="24" w:type="dxa"/>
+              <w:right w:w="24" w:type="dxa"/>
+            </w:tcMar>
+          </w:tcPr>
+          <w:p>
+            <w:pPr>
+              <w:spacing w:before="0" w:after="0" w:line="240" w:lineRule="auto"/>
+            </w:pPr>
+            <w:r>
+              <w:rPr>
+                <w:sz w:val="9"/>
               </w:rPr>
               <w:t>PAGE_READ</w:t>
             </w:r>
@@ -28898,11 +29267,20 @@
         <w:tc>
           <w:tcPr>
             <w:tcW w:type="dxa" w:w="1584"/>
-          </w:tcPr>
-          <w:p>
-            <w:r>
-              <w:rPr>
-                <w:sz w:val="12"/>
+            <w:tcMar>
+              <w:top w:w="12" w:type="dxa"/>
+              <w:bottom w:w="12" w:type="dxa"/>
+              <w:left w:w="24" w:type="dxa"/>
+              <w:right w:w="24" w:type="dxa"/>
+            </w:tcMar>
+          </w:tcPr>
+          <w:p>
+            <w:pPr>
+              <w:spacing w:before="0" w:after="0" w:line="240" w:lineRule="auto"/>
+            </w:pPr>
+            <w:r>
+              <w:rPr>
+                <w:sz w:val="9"/>
               </w:rPr>
               <w:t>ALIAS_ONLY / EXCLUDE_FROM_CONTROL_DENOMINATOR</w:t>
             </w:r>
@@ -28913,11 +29291,20 @@
         <w:tc>
           <w:tcPr>
             <w:tcW w:type="dxa" w:w="1584"/>
-          </w:tcPr>
-          <w:p>
-            <w:r>
-              <w:rPr>
-                <w:sz w:val="12"/>
+            <w:tcMar>
+              <w:top w:w="12" w:type="dxa"/>
+              <w:bottom w:w="12" w:type="dxa"/>
+              <w:left w:w="24" w:type="dxa"/>
+              <w:right w:w="24" w:type="dxa"/>
+            </w:tcMar>
+          </w:tcPr>
+          <w:p>
+            <w:pPr>
+              <w:spacing w:before="0" w:after="0" w:line="240" w:lineRule="auto"/>
+            </w:pPr>
+            <w:r>
+              <w:rPr>
+                <w:sz w:val="9"/>
               </w:rPr>
               <w:t>CTRL-…COMPANY-PROGRESS-SUMMARY-OPEN</w:t>
             </w:r>
@@ -28926,11 +29313,20 @@
         <w:tc>
           <w:tcPr>
             <w:tcW w:type="dxa" w:w="1584"/>
-          </w:tcPr>
-          <w:p>
-            <w:r>
-              <w:rPr>
-                <w:sz w:val="12"/>
+            <w:tcMar>
+              <w:top w:w="12" w:type="dxa"/>
+              <w:bottom w:w="12" w:type="dxa"/>
+              <w:left w:w="24" w:type="dxa"/>
+              <w:right w:w="24" w:type="dxa"/>
+            </w:tcMar>
+          </w:tcPr>
+          <w:p>
+            <w:pPr>
+              <w:spacing w:before="0" w:after="0" w:line="240" w:lineRule="auto"/>
+            </w:pPr>
+            <w:r>
+              <w:rPr>
+                <w:sz w:val="9"/>
               </w:rPr>
               <w:t>CTRL-WORKSPACE-WB-01-COMPANY-PROGRESS-SUMMARY-OPEN</w:t>
             </w:r>
@@ -28939,11 +29335,20 @@
         <w:tc>
           <w:tcPr>
             <w:tcW w:type="dxa" w:w="1584"/>
-          </w:tcPr>
-          <w:p>
-            <w:r>
-              <w:rPr>
-                <w:sz w:val="12"/>
+            <w:tcMar>
+              <w:top w:w="12" w:type="dxa"/>
+              <w:bottom w:w="12" w:type="dxa"/>
+              <w:left w:w="24" w:type="dxa"/>
+              <w:right w:w="24" w:type="dxa"/>
+            </w:tcMar>
+          </w:tcPr>
+          <w:p>
+            <w:pPr>
+              <w:spacing w:before="0" w:after="0" w:line="240" w:lineRule="auto"/>
+            </w:pPr>
+            <w:r>
+              <w:rPr>
+                <w:sz w:val="9"/>
               </w:rPr>
               <w:t>01_ACPOS_Global_Intelligent_Brain_Information_Lifecycle_Mother_Basic_Logic_Design_Normative_Contract_v4.docx</w:t>
             </w:r>
@@ -28952,11 +29357,20 @@
         <w:tc>
           <w:tcPr>
             <w:tcW w:type="dxa" w:w="1584"/>
-          </w:tcPr>
-          <w:p>
-            <w:r>
-              <w:rPr>
-                <w:sz w:val="12"/>
+            <w:tcMar>
+              <w:top w:w="12" w:type="dxa"/>
+              <w:bottom w:w="12" w:type="dxa"/>
+              <w:left w:w="24" w:type="dxa"/>
+              <w:right w:w="24" w:type="dxa"/>
+            </w:tcMar>
+          </w:tcPr>
+          <w:p>
+            <w:pPr>
+              <w:spacing w:before="0" w:after="0" w:line="240" w:lineRule="auto"/>
+            </w:pPr>
+            <w:r>
+              <w:rPr>
+                <w:sz w:val="9"/>
               </w:rPr>
               <w:t>table 26 / row 9</w:t>
             </w:r>
@@ -28965,11 +29379,20 @@
         <w:tc>
           <w:tcPr>
             <w:tcW w:type="dxa" w:w="1584"/>
-          </w:tcPr>
-          <w:p>
-            <w:r>
-              <w:rPr>
-                <w:sz w:val="12"/>
+            <w:tcMar>
+              <w:top w:w="12" w:type="dxa"/>
+              <w:bottom w:w="12" w:type="dxa"/>
+              <w:left w:w="24" w:type="dxa"/>
+              <w:right w:w="24" w:type="dxa"/>
+            </w:tcMar>
+          </w:tcPr>
+          <w:p>
+            <w:pPr>
+              <w:spacing w:before="0" w:after="0" w:line="240" w:lineRule="auto"/>
+            </w:pPr>
+            <w:r>
+              <w:rPr>
+                <w:sz w:val="9"/>
               </w:rPr>
               <w:t>table 73 / row 7</w:t>
             </w:r>
@@ -28978,11 +29401,20 @@
         <w:tc>
           <w:tcPr>
             <w:tcW w:type="dxa" w:w="1584"/>
-          </w:tcPr>
-          <w:p>
-            <w:r>
-              <w:rPr>
-                <w:sz w:val="12"/>
+            <w:tcMar>
+              <w:top w:w="12" w:type="dxa"/>
+              <w:bottom w:w="12" w:type="dxa"/>
+              <w:left w:w="24" w:type="dxa"/>
+              <w:right w:w="24" w:type="dxa"/>
+            </w:tcMar>
+          </w:tcPr>
+          <w:p>
+            <w:pPr>
+              <w:spacing w:before="0" w:after="0" w:line="240" w:lineRule="auto"/>
+            </w:pPr>
+            <w:r>
+              <w:rPr>
+                <w:sz w:val="9"/>
               </w:rPr>
               <w:t>PAGE_READ</w:t>
             </w:r>
@@ -28991,11 +29423,20 @@
         <w:tc>
           <w:tcPr>
             <w:tcW w:type="dxa" w:w="1584"/>
-          </w:tcPr>
-          <w:p>
-            <w:r>
-              <w:rPr>
-                <w:sz w:val="12"/>
+            <w:tcMar>
+              <w:top w:w="12" w:type="dxa"/>
+              <w:bottom w:w="12" w:type="dxa"/>
+              <w:left w:w="24" w:type="dxa"/>
+              <w:right w:w="24" w:type="dxa"/>
+            </w:tcMar>
+          </w:tcPr>
+          <w:p>
+            <w:pPr>
+              <w:spacing w:before="0" w:after="0" w:line="240" w:lineRule="auto"/>
+            </w:pPr>
+            <w:r>
+              <w:rPr>
+                <w:sz w:val="9"/>
               </w:rPr>
               <w:t>ALIAS_ONLY / EXCLUDE_FROM_CONTROL_DENOMINATOR</w:t>
             </w:r>
@@ -29006,11 +29447,20 @@
         <w:tc>
           <w:tcPr>
             <w:tcW w:type="dxa" w:w="1584"/>
-          </w:tcPr>
-          <w:p>
-            <w:r>
-              <w:rPr>
-                <w:sz w:val="12"/>
+            <w:tcMar>
+              <w:top w:w="12" w:type="dxa"/>
+              <w:bottom w:w="12" w:type="dxa"/>
+              <w:left w:w="24" w:type="dxa"/>
+              <w:right w:w="24" w:type="dxa"/>
+            </w:tcMar>
+          </w:tcPr>
+          <w:p>
+            <w:pPr>
+              <w:spacing w:before="0" w:after="0" w:line="240" w:lineRule="auto"/>
+            </w:pPr>
+            <w:r>
+              <w:rPr>
+                <w:sz w:val="9"/>
               </w:rPr>
               <w:t>CTRL-…COMPANY-PROJECT-COUNT-OPEN</w:t>
             </w:r>
@@ -29019,11 +29469,20 @@
         <w:tc>
           <w:tcPr>
             <w:tcW w:type="dxa" w:w="1584"/>
-          </w:tcPr>
-          <w:p>
-            <w:r>
-              <w:rPr>
-                <w:sz w:val="12"/>
+            <w:tcMar>
+              <w:top w:w="12" w:type="dxa"/>
+              <w:bottom w:w="12" w:type="dxa"/>
+              <w:left w:w="24" w:type="dxa"/>
+              <w:right w:w="24" w:type="dxa"/>
+            </w:tcMar>
+          </w:tcPr>
+          <w:p>
+            <w:pPr>
+              <w:spacing w:before="0" w:after="0" w:line="240" w:lineRule="auto"/>
+            </w:pPr>
+            <w:r>
+              <w:rPr>
+                <w:sz w:val="9"/>
               </w:rPr>
               <w:t>CTRL-WORKSPACE-WB-01-COMPANY-PROJECT-COUNT-OPEN</w:t>
             </w:r>
@@ -29032,11 +29491,20 @@
         <w:tc>
           <w:tcPr>
             <w:tcW w:type="dxa" w:w="1584"/>
-          </w:tcPr>
-          <w:p>
-            <w:r>
-              <w:rPr>
-                <w:sz w:val="12"/>
+            <w:tcMar>
+              <w:top w:w="12" w:type="dxa"/>
+              <w:bottom w:w="12" w:type="dxa"/>
+              <w:left w:w="24" w:type="dxa"/>
+              <w:right w:w="24" w:type="dxa"/>
+            </w:tcMar>
+          </w:tcPr>
+          <w:p>
+            <w:pPr>
+              <w:spacing w:before="0" w:after="0" w:line="240" w:lineRule="auto"/>
+            </w:pPr>
+            <w:r>
+              <w:rPr>
+                <w:sz w:val="9"/>
               </w:rPr>
               <w:t>01_ACPOS_Global_Intelligent_Brain_Information_Lifecycle_Mother_Basic_Logic_Design_Normative_Contract_v4.docx</w:t>
             </w:r>
@@ -29045,11 +29513,20 @@
         <w:tc>
           <w:tcPr>
             <w:tcW w:type="dxa" w:w="1584"/>
-          </w:tcPr>
-          <w:p>
-            <w:r>
-              <w:rPr>
-                <w:sz w:val="12"/>
+            <w:tcMar>
+              <w:top w:w="12" w:type="dxa"/>
+              <w:bottom w:w="12" w:type="dxa"/>
+              <w:left w:w="24" w:type="dxa"/>
+              <w:right w:w="24" w:type="dxa"/>
+            </w:tcMar>
+          </w:tcPr>
+          <w:p>
+            <w:pPr>
+              <w:spacing w:before="0" w:after="0" w:line="240" w:lineRule="auto"/>
+            </w:pPr>
+            <w:r>
+              <w:rPr>
+                <w:sz w:val="9"/>
               </w:rPr>
               <w:t>table 26 / row 2</w:t>
             </w:r>
@@ -29058,11 +29535,20 @@
         <w:tc>
           <w:tcPr>
             <w:tcW w:type="dxa" w:w="1584"/>
-          </w:tcPr>
-          <w:p>
-            <w:r>
-              <w:rPr>
-                <w:sz w:val="12"/>
+            <w:tcMar>
+              <w:top w:w="12" w:type="dxa"/>
+              <w:bottom w:w="12" w:type="dxa"/>
+              <w:left w:w="24" w:type="dxa"/>
+              <w:right w:w="24" w:type="dxa"/>
+            </w:tcMar>
+          </w:tcPr>
+          <w:p>
+            <w:pPr>
+              <w:spacing w:before="0" w:after="0" w:line="240" w:lineRule="auto"/>
+            </w:pPr>
+            <w:r>
+              <w:rPr>
+                <w:sz w:val="9"/>
               </w:rPr>
               <w:t>table 73 / row 8</w:t>
             </w:r>
@@ -29071,11 +29557,20 @@
         <w:tc>
           <w:tcPr>
             <w:tcW w:type="dxa" w:w="1584"/>
-          </w:tcPr>
-          <w:p>
-            <w:r>
-              <w:rPr>
-                <w:sz w:val="12"/>
+            <w:tcMar>
+              <w:top w:w="12" w:type="dxa"/>
+              <w:bottom w:w="12" w:type="dxa"/>
+              <w:left w:w="24" w:type="dxa"/>
+              <w:right w:w="24" w:type="dxa"/>
+            </w:tcMar>
+          </w:tcPr>
+          <w:p>
+            <w:pPr>
+              <w:spacing w:before="0" w:after="0" w:line="240" w:lineRule="auto"/>
+            </w:pPr>
+            <w:r>
+              <w:rPr>
+                <w:sz w:val="9"/>
               </w:rPr>
               <w:t>PAGE_READ</w:t>
             </w:r>
@@ -29084,11 +29579,20 @@
         <w:tc>
           <w:tcPr>
             <w:tcW w:type="dxa" w:w="1584"/>
-          </w:tcPr>
-          <w:p>
-            <w:r>
-              <w:rPr>
-                <w:sz w:val="12"/>
+            <w:tcMar>
+              <w:top w:w="12" w:type="dxa"/>
+              <w:bottom w:w="12" w:type="dxa"/>
+              <w:left w:w="24" w:type="dxa"/>
+              <w:right w:w="24" w:type="dxa"/>
+            </w:tcMar>
+          </w:tcPr>
+          <w:p>
+            <w:pPr>
+              <w:spacing w:before="0" w:after="0" w:line="240" w:lineRule="auto"/>
+            </w:pPr>
+            <w:r>
+              <w:rPr>
+                <w:sz w:val="9"/>
               </w:rPr>
               <w:t>ALIAS_ONLY / EXCLUDE_FROM_CONTROL_DENOMINATOR</w:t>
             </w:r>
@@ -29099,11 +29603,20 @@
         <w:tc>
           <w:tcPr>
             <w:tcW w:type="dxa" w:w="1584"/>
-          </w:tcPr>
-          <w:p>
-            <w:r>
-              <w:rPr>
-                <w:sz w:val="12"/>
+            <w:tcMar>
+              <w:top w:w="12" w:type="dxa"/>
+              <w:bottom w:w="12" w:type="dxa"/>
+              <w:left w:w="24" w:type="dxa"/>
+              <w:right w:w="24" w:type="dxa"/>
+            </w:tcMar>
+          </w:tcPr>
+          <w:p>
+            <w:pPr>
+              <w:spacing w:before="0" w:after="0" w:line="240" w:lineRule="auto"/>
+            </w:pPr>
+            <w:r>
+              <w:rPr>
+                <w:sz w:val="9"/>
               </w:rPr>
               <w:t>CTRL-…COMPANY-RUNNING-PROJECT-COUNT-OPEN</w:t>
             </w:r>
@@ -29112,11 +29625,20 @@
         <w:tc>
           <w:tcPr>
             <w:tcW w:type="dxa" w:w="1584"/>
-          </w:tcPr>
-          <w:p>
-            <w:r>
-              <w:rPr>
-                <w:sz w:val="12"/>
+            <w:tcMar>
+              <w:top w:w="12" w:type="dxa"/>
+              <w:bottom w:w="12" w:type="dxa"/>
+              <w:left w:w="24" w:type="dxa"/>
+              <w:right w:w="24" w:type="dxa"/>
+            </w:tcMar>
+          </w:tcPr>
+          <w:p>
+            <w:pPr>
+              <w:spacing w:before="0" w:after="0" w:line="240" w:lineRule="auto"/>
+            </w:pPr>
+            <w:r>
+              <w:rPr>
+                <w:sz w:val="9"/>
               </w:rPr>
               <w:t>CTRL-WORKSPACE-WB-01-COMPANY-RUNNING-PROJECT-COUNT-OPEN</w:t>
             </w:r>
@@ -29125,11 +29647,20 @@
         <w:tc>
           <w:tcPr>
             <w:tcW w:type="dxa" w:w="1584"/>
-          </w:tcPr>
-          <w:p>
-            <w:r>
-              <w:rPr>
-                <w:sz w:val="12"/>
+            <w:tcMar>
+              <w:top w:w="12" w:type="dxa"/>
+              <w:bottom w:w="12" w:type="dxa"/>
+              <w:left w:w="24" w:type="dxa"/>
+              <w:right w:w="24" w:type="dxa"/>
+            </w:tcMar>
+          </w:tcPr>
+          <w:p>
+            <w:pPr>
+              <w:spacing w:before="0" w:after="0" w:line="240" w:lineRule="auto"/>
+            </w:pPr>
+            <w:r>
+              <w:rPr>
+                <w:sz w:val="9"/>
               </w:rPr>
               <w:t>01_ACPOS_Global_Intelligent_Brain_Information_Lifecycle_Mother_Basic_Logic_Design_Normative_Contract_v4.docx</w:t>
             </w:r>
@@ -29138,11 +29669,20 @@
         <w:tc>
           <w:tcPr>
             <w:tcW w:type="dxa" w:w="1584"/>
-          </w:tcPr>
-          <w:p>
-            <w:r>
-              <w:rPr>
-                <w:sz w:val="12"/>
+            <w:tcMar>
+              <w:top w:w="12" w:type="dxa"/>
+              <w:bottom w:w="12" w:type="dxa"/>
+              <w:left w:w="24" w:type="dxa"/>
+              <w:right w:w="24" w:type="dxa"/>
+            </w:tcMar>
+          </w:tcPr>
+          <w:p>
+            <w:pPr>
+              <w:spacing w:before="0" w:after="0" w:line="240" w:lineRule="auto"/>
+            </w:pPr>
+            <w:r>
+              <w:rPr>
+                <w:sz w:val="9"/>
               </w:rPr>
               <w:t>table 26 / row 3</w:t>
             </w:r>
@@ -29151,11 +29691,20 @@
         <w:tc>
           <w:tcPr>
             <w:tcW w:type="dxa" w:w="1584"/>
-          </w:tcPr>
-          <w:p>
-            <w:r>
-              <w:rPr>
-                <w:sz w:val="12"/>
+            <w:tcMar>
+              <w:top w:w="12" w:type="dxa"/>
+              <w:bottom w:w="12" w:type="dxa"/>
+              <w:left w:w="24" w:type="dxa"/>
+              <w:right w:w="24" w:type="dxa"/>
+            </w:tcMar>
+          </w:tcPr>
+          <w:p>
+            <w:pPr>
+              <w:spacing w:before="0" w:after="0" w:line="240" w:lineRule="auto"/>
+            </w:pPr>
+            <w:r>
+              <w:rPr>
+                <w:sz w:val="9"/>
               </w:rPr>
               <w:t>table 73 / row 9</w:t>
             </w:r>
@@ -29164,11 +29713,20 @@
         <w:tc>
           <w:tcPr>
             <w:tcW w:type="dxa" w:w="1584"/>
-          </w:tcPr>
-          <w:p>
-            <w:r>
-              <w:rPr>
-                <w:sz w:val="12"/>
+            <w:tcMar>
+              <w:top w:w="12" w:type="dxa"/>
+              <w:bottom w:w="12" w:type="dxa"/>
+              <w:left w:w="24" w:type="dxa"/>
+              <w:right w:w="24" w:type="dxa"/>
+            </w:tcMar>
+          </w:tcPr>
+          <w:p>
+            <w:pPr>
+              <w:spacing w:before="0" w:after="0" w:line="240" w:lineRule="auto"/>
+            </w:pPr>
+            <w:r>
+              <w:rPr>
+                <w:sz w:val="9"/>
               </w:rPr>
               <w:t>PAGE_READ</w:t>
             </w:r>
@@ -29177,11 +29735,20 @@
         <w:tc>
           <w:tcPr>
             <w:tcW w:type="dxa" w:w="1584"/>
-          </w:tcPr>
-          <w:p>
-            <w:r>
-              <w:rPr>
-                <w:sz w:val="12"/>
+            <w:tcMar>
+              <w:top w:w="12" w:type="dxa"/>
+              <w:bottom w:w="12" w:type="dxa"/>
+              <w:left w:w="24" w:type="dxa"/>
+              <w:right w:w="24" w:type="dxa"/>
+            </w:tcMar>
+          </w:tcPr>
+          <w:p>
+            <w:pPr>
+              <w:spacing w:before="0" w:after="0" w:line="240" w:lineRule="auto"/>
+            </w:pPr>
+            <w:r>
+              <w:rPr>
+                <w:sz w:val="9"/>
               </w:rPr>
               <w:t>ALIAS_ONLY / EXCLUDE_FROM_CONTROL_DENOMINATOR</w:t>
             </w:r>
@@ -29192,11 +29759,20 @@
         <w:tc>
           <w:tcPr>
             <w:tcW w:type="dxa" w:w="1584"/>
-          </w:tcPr>
-          <w:p>
-            <w:r>
-              <w:rPr>
-                <w:sz w:val="12"/>
+            <w:tcMar>
+              <w:top w:w="12" w:type="dxa"/>
+              <w:bottom w:w="12" w:type="dxa"/>
+              <w:left w:w="24" w:type="dxa"/>
+              <w:right w:w="24" w:type="dxa"/>
+            </w:tcMar>
+          </w:tcPr>
+          <w:p>
+            <w:pPr>
+              <w:spacing w:before="0" w:after="0" w:line="240" w:lineRule="auto"/>
+            </w:pPr>
+            <w:r>
+              <w:rPr>
+                <w:sz w:val="9"/>
               </w:rPr>
               <w:t>CTRL-…INDUSTRY-NEWS-OPEN</w:t>
             </w:r>
@@ -29205,11 +29781,20 @@
         <w:tc>
           <w:tcPr>
             <w:tcW w:type="dxa" w:w="1584"/>
-          </w:tcPr>
-          <w:p>
-            <w:r>
-              <w:rPr>
-                <w:sz w:val="12"/>
+            <w:tcMar>
+              <w:top w:w="12" w:type="dxa"/>
+              <w:bottom w:w="12" w:type="dxa"/>
+              <w:left w:w="24" w:type="dxa"/>
+              <w:right w:w="24" w:type="dxa"/>
+            </w:tcMar>
+          </w:tcPr>
+          <w:p>
+            <w:pPr>
+              <w:spacing w:before="0" w:after="0" w:line="240" w:lineRule="auto"/>
+            </w:pPr>
+            <w:r>
+              <w:rPr>
+                <w:sz w:val="9"/>
               </w:rPr>
               <w:t>CTRL-WORKSPACE-WB-01-INDUSTRY-NEWS-OPEN</w:t>
             </w:r>
@@ -29218,11 +29803,20 @@
         <w:tc>
           <w:tcPr>
             <w:tcW w:type="dxa" w:w="1584"/>
-          </w:tcPr>
-          <w:p>
-            <w:r>
-              <w:rPr>
-                <w:sz w:val="12"/>
+            <w:tcMar>
+              <w:top w:w="12" w:type="dxa"/>
+              <w:bottom w:w="12" w:type="dxa"/>
+              <w:left w:w="24" w:type="dxa"/>
+              <w:right w:w="24" w:type="dxa"/>
+            </w:tcMar>
+          </w:tcPr>
+          <w:p>
+            <w:pPr>
+              <w:spacing w:before="0" w:after="0" w:line="240" w:lineRule="auto"/>
+            </w:pPr>
+            <w:r>
+              <w:rPr>
+                <w:sz w:val="9"/>
               </w:rPr>
               <w:t>01_ACPOS_Global_Intelligent_Brain_Information_Lifecycle_Mother_Basic_Logic_Design_Normative_Contract_v4.docx</w:t>
             </w:r>
@@ -29231,11 +29825,20 @@
         <w:tc>
           <w:tcPr>
             <w:tcW w:type="dxa" w:w="1584"/>
-          </w:tcPr>
-          <w:p>
-            <w:r>
-              <w:rPr>
-                <w:sz w:val="12"/>
+            <w:tcMar>
+              <w:top w:w="12" w:type="dxa"/>
+              <w:bottom w:w="12" w:type="dxa"/>
+              <w:left w:w="24" w:type="dxa"/>
+              <w:right w:w="24" w:type="dxa"/>
+            </w:tcMar>
+          </w:tcPr>
+          <w:p>
+            <w:pPr>
+              <w:spacing w:before="0" w:after="0" w:line="240" w:lineRule="auto"/>
+            </w:pPr>
+            <w:r>
+              <w:rPr>
+                <w:sz w:val="9"/>
               </w:rPr>
               <w:t>table 26 / row 13</w:t>
             </w:r>
@@ -29244,11 +29847,20 @@
         <w:tc>
           <w:tcPr>
             <w:tcW w:type="dxa" w:w="1584"/>
-          </w:tcPr>
-          <w:p>
-            <w:r>
-              <w:rPr>
-                <w:sz w:val="12"/>
+            <w:tcMar>
+              <w:top w:w="12" w:type="dxa"/>
+              <w:bottom w:w="12" w:type="dxa"/>
+              <w:left w:w="24" w:type="dxa"/>
+              <w:right w:w="24" w:type="dxa"/>
+            </w:tcMar>
+          </w:tcPr>
+          <w:p>
+            <w:pPr>
+              <w:spacing w:before="0" w:after="0" w:line="240" w:lineRule="auto"/>
+            </w:pPr>
+            <w:r>
+              <w:rPr>
+                <w:sz w:val="9"/>
               </w:rPr>
               <w:t>table 73 / row 10</w:t>
             </w:r>
@@ -29257,11 +29869,20 @@
         <w:tc>
           <w:tcPr>
             <w:tcW w:type="dxa" w:w="1584"/>
-          </w:tcPr>
-          <w:p>
-            <w:r>
-              <w:rPr>
-                <w:sz w:val="12"/>
+            <w:tcMar>
+              <w:top w:w="12" w:type="dxa"/>
+              <w:bottom w:w="12" w:type="dxa"/>
+              <w:left w:w="24" w:type="dxa"/>
+              <w:right w:w="24" w:type="dxa"/>
+            </w:tcMar>
+          </w:tcPr>
+          <w:p>
+            <w:pPr>
+              <w:spacing w:before="0" w:after="0" w:line="240" w:lineRule="auto"/>
+            </w:pPr>
+            <w:r>
+              <w:rPr>
+                <w:sz w:val="9"/>
               </w:rPr>
               <w:t>PAGE_READ</w:t>
             </w:r>
@@ -29270,11 +29891,20 @@
         <w:tc>
           <w:tcPr>
             <w:tcW w:type="dxa" w:w="1584"/>
-          </w:tcPr>
-          <w:p>
-            <w:r>
-              <w:rPr>
-                <w:sz w:val="12"/>
+            <w:tcMar>
+              <w:top w:w="12" w:type="dxa"/>
+              <w:bottom w:w="12" w:type="dxa"/>
+              <w:left w:w="24" w:type="dxa"/>
+              <w:right w:w="24" w:type="dxa"/>
+            </w:tcMar>
+          </w:tcPr>
+          <w:p>
+            <w:pPr>
+              <w:spacing w:before="0" w:after="0" w:line="240" w:lineRule="auto"/>
+            </w:pPr>
+            <w:r>
+              <w:rPr>
+                <w:sz w:val="9"/>
               </w:rPr>
               <w:t>ALIAS_ONLY / EXCLUDE_FROM_CONTROL_DENOMINATOR</w:t>
             </w:r>
@@ -29285,11 +29915,20 @@
         <w:tc>
           <w:tcPr>
             <w:tcW w:type="dxa" w:w="1584"/>
-          </w:tcPr>
-          <w:p>
-            <w:r>
-              <w:rPr>
-                <w:sz w:val="12"/>
+            <w:tcMar>
+              <w:top w:w="12" w:type="dxa"/>
+              <w:bottom w:w="12" w:type="dxa"/>
+              <w:left w:w="24" w:type="dxa"/>
+              <w:right w:w="24" w:type="dxa"/>
+            </w:tcMar>
+          </w:tcPr>
+          <w:p>
+            <w:pPr>
+              <w:spacing w:before="0" w:after="0" w:line="240" w:lineRule="auto"/>
+            </w:pPr>
+            <w:r>
+              <w:rPr>
+                <w:sz w:val="9"/>
               </w:rPr>
               <w:t>CTRL-…NOTIFICATIONS-OPEN</w:t>
             </w:r>
@@ -29298,11 +29937,20 @@
         <w:tc>
           <w:tcPr>
             <w:tcW w:type="dxa" w:w="1584"/>
-          </w:tcPr>
-          <w:p>
-            <w:r>
-              <w:rPr>
-                <w:sz w:val="12"/>
+            <w:tcMar>
+              <w:top w:w="12" w:type="dxa"/>
+              <w:bottom w:w="12" w:type="dxa"/>
+              <w:left w:w="24" w:type="dxa"/>
+              <w:right w:w="24" w:type="dxa"/>
+            </w:tcMar>
+          </w:tcPr>
+          <w:p>
+            <w:pPr>
+              <w:spacing w:before="0" w:after="0" w:line="240" w:lineRule="auto"/>
+            </w:pPr>
+            <w:r>
+              <w:rPr>
+                <w:sz w:val="9"/>
               </w:rPr>
               <w:t>CTRL-WORKSPACE-WB-01-NOTIFICATIONS-OPEN</w:t>
             </w:r>
@@ -29311,11 +29959,20 @@
         <w:tc>
           <w:tcPr>
             <w:tcW w:type="dxa" w:w="1584"/>
-          </w:tcPr>
-          <w:p>
-            <w:r>
-              <w:rPr>
-                <w:sz w:val="12"/>
+            <w:tcMar>
+              <w:top w:w="12" w:type="dxa"/>
+              <w:bottom w:w="12" w:type="dxa"/>
+              <w:left w:w="24" w:type="dxa"/>
+              <w:right w:w="24" w:type="dxa"/>
+            </w:tcMar>
+          </w:tcPr>
+          <w:p>
+            <w:pPr>
+              <w:spacing w:before="0" w:after="0" w:line="240" w:lineRule="auto"/>
+            </w:pPr>
+            <w:r>
+              <w:rPr>
+                <w:sz w:val="9"/>
               </w:rPr>
               <w:t>01_ACPOS_Global_Intelligent_Brain_Information_Lifecycle_Mother_Basic_Logic_Design_Normative_Contract_v4.docx</w:t>
             </w:r>
@@ -29324,11 +29981,20 @@
         <w:tc>
           <w:tcPr>
             <w:tcW w:type="dxa" w:w="1584"/>
-          </w:tcPr>
-          <w:p>
-            <w:r>
-              <w:rPr>
-                <w:sz w:val="12"/>
+            <w:tcMar>
+              <w:top w:w="12" w:type="dxa"/>
+              <w:bottom w:w="12" w:type="dxa"/>
+              <w:left w:w="24" w:type="dxa"/>
+              <w:right w:w="24" w:type="dxa"/>
+            </w:tcMar>
+          </w:tcPr>
+          <w:p>
+            <w:pPr>
+              <w:spacing w:before="0" w:after="0" w:line="240" w:lineRule="auto"/>
+            </w:pPr>
+            <w:r>
+              <w:rPr>
+                <w:sz w:val="9"/>
               </w:rPr>
               <w:t>table 26 / row 11</w:t>
             </w:r>
@@ -29337,11 +30003,20 @@
         <w:tc>
           <w:tcPr>
             <w:tcW w:type="dxa" w:w="1584"/>
-          </w:tcPr>
-          <w:p>
-            <w:r>
-              <w:rPr>
-                <w:sz w:val="12"/>
+            <w:tcMar>
+              <w:top w:w="12" w:type="dxa"/>
+              <w:bottom w:w="12" w:type="dxa"/>
+              <w:left w:w="24" w:type="dxa"/>
+              <w:right w:w="24" w:type="dxa"/>
+            </w:tcMar>
+          </w:tcPr>
+          <w:p>
+            <w:pPr>
+              <w:spacing w:before="0" w:after="0" w:line="240" w:lineRule="auto"/>
+            </w:pPr>
+            <w:r>
+              <w:rPr>
+                <w:sz w:val="9"/>
               </w:rPr>
               <w:t>table 73 / row 11</w:t>
             </w:r>
@@ -29350,11 +30025,20 @@
         <w:tc>
           <w:tcPr>
             <w:tcW w:type="dxa" w:w="1584"/>
-          </w:tcPr>
-          <w:p>
-            <w:r>
-              <w:rPr>
-                <w:sz w:val="12"/>
+            <w:tcMar>
+              <w:top w:w="12" w:type="dxa"/>
+              <w:bottom w:w="12" w:type="dxa"/>
+              <w:left w:w="24" w:type="dxa"/>
+              <w:right w:w="24" w:type="dxa"/>
+            </w:tcMar>
+          </w:tcPr>
+          <w:p>
+            <w:pPr>
+              <w:spacing w:before="0" w:after="0" w:line="240" w:lineRule="auto"/>
+            </w:pPr>
+            <w:r>
+              <w:rPr>
+                <w:sz w:val="9"/>
               </w:rPr>
               <w:t>PAGE_READ</w:t>
             </w:r>
@@ -29363,11 +30047,20 @@
         <w:tc>
           <w:tcPr>
             <w:tcW w:type="dxa" w:w="1584"/>
-          </w:tcPr>
-          <w:p>
-            <w:r>
-              <w:rPr>
-                <w:sz w:val="12"/>
+            <w:tcMar>
+              <w:top w:w="12" w:type="dxa"/>
+              <w:bottom w:w="12" w:type="dxa"/>
+              <w:left w:w="24" w:type="dxa"/>
+              <w:right w:w="24" w:type="dxa"/>
+            </w:tcMar>
+          </w:tcPr>
+          <w:p>
+            <w:pPr>
+              <w:spacing w:before="0" w:after="0" w:line="240" w:lineRule="auto"/>
+            </w:pPr>
+            <w:r>
+              <w:rPr>
+                <w:sz w:val="9"/>
               </w:rPr>
               <w:t>ALIAS_ONLY / EXCLUDE_FROM_CONTROL_DENOMINATOR</w:t>
             </w:r>
@@ -29378,11 +30071,20 @@
         <w:tc>
           <w:tcPr>
             <w:tcW w:type="dxa" w:w="1584"/>
-          </w:tcPr>
-          <w:p>
-            <w:r>
-              <w:rPr>
-                <w:sz w:val="12"/>
+            <w:tcMar>
+              <w:top w:w="12" w:type="dxa"/>
+              <w:bottom w:w="12" w:type="dxa"/>
+              <w:left w:w="24" w:type="dxa"/>
+              <w:right w:w="24" w:type="dxa"/>
+            </w:tcMar>
+          </w:tcPr>
+          <w:p>
+            <w:pPr>
+              <w:spacing w:before="0" w:after="0" w:line="240" w:lineRule="auto"/>
+            </w:pPr>
+            <w:r>
+              <w:rPr>
+                <w:sz w:val="9"/>
               </w:rPr>
               <w:t>CTRL-…PRODUCTION-SUMMARY-OPEN</w:t>
             </w:r>
@@ -29391,11 +30093,20 @@
         <w:tc>
           <w:tcPr>
             <w:tcW w:type="dxa" w:w="1584"/>
-          </w:tcPr>
-          <w:p>
-            <w:r>
-              <w:rPr>
-                <w:sz w:val="12"/>
+            <w:tcMar>
+              <w:top w:w="12" w:type="dxa"/>
+              <w:bottom w:w="12" w:type="dxa"/>
+              <w:left w:w="24" w:type="dxa"/>
+              <w:right w:w="24" w:type="dxa"/>
+            </w:tcMar>
+          </w:tcPr>
+          <w:p>
+            <w:pPr>
+              <w:spacing w:before="0" w:after="0" w:line="240" w:lineRule="auto"/>
+            </w:pPr>
+            <w:r>
+              <w:rPr>
+                <w:sz w:val="9"/>
               </w:rPr>
               <w:t>CTRL-WORKSPACE-WB-01-PRODUCTION-SUMMARY-OPEN</w:t>
             </w:r>
@@ -29404,11 +30115,20 @@
         <w:tc>
           <w:tcPr>
             <w:tcW w:type="dxa" w:w="1584"/>
-          </w:tcPr>
-          <w:p>
-            <w:r>
-              <w:rPr>
-                <w:sz w:val="12"/>
+            <w:tcMar>
+              <w:top w:w="12" w:type="dxa"/>
+              <w:bottom w:w="12" w:type="dxa"/>
+              <w:left w:w="24" w:type="dxa"/>
+              <w:right w:w="24" w:type="dxa"/>
+            </w:tcMar>
+          </w:tcPr>
+          <w:p>
+            <w:pPr>
+              <w:spacing w:before="0" w:after="0" w:line="240" w:lineRule="auto"/>
+            </w:pPr>
+            <w:r>
+              <w:rPr>
+                <w:sz w:val="9"/>
               </w:rPr>
               <w:t>01_ACPOS_Global_Intelligent_Brain_Information_Lifecycle_Mother_Basic_Logic_Design_Normative_Contract_v4.docx</w:t>
             </w:r>
@@ -29417,11 +30137,20 @@
         <w:tc>
           <w:tcPr>
             <w:tcW w:type="dxa" w:w="1584"/>
-          </w:tcPr>
-          <w:p>
-            <w:r>
-              <w:rPr>
-                <w:sz w:val="12"/>
+            <w:tcMar>
+              <w:top w:w="12" w:type="dxa"/>
+              <w:bottom w:w="12" w:type="dxa"/>
+              <w:left w:w="24" w:type="dxa"/>
+              <w:right w:w="24" w:type="dxa"/>
+            </w:tcMar>
+          </w:tcPr>
+          <w:p>
+            <w:pPr>
+              <w:spacing w:before="0" w:after="0" w:line="240" w:lineRule="auto"/>
+            </w:pPr>
+            <w:r>
+              <w:rPr>
+                <w:sz w:val="9"/>
               </w:rPr>
               <w:t>table 26 / row 10</w:t>
             </w:r>
@@ -29430,11 +30159,20 @@
         <w:tc>
           <w:tcPr>
             <w:tcW w:type="dxa" w:w="1584"/>
-          </w:tcPr>
-          <w:p>
-            <w:r>
-              <w:rPr>
-                <w:sz w:val="12"/>
+            <w:tcMar>
+              <w:top w:w="12" w:type="dxa"/>
+              <w:bottom w:w="12" w:type="dxa"/>
+              <w:left w:w="24" w:type="dxa"/>
+              <w:right w:w="24" w:type="dxa"/>
+            </w:tcMar>
+          </w:tcPr>
+          <w:p>
+            <w:pPr>
+              <w:spacing w:before="0" w:after="0" w:line="240" w:lineRule="auto"/>
+            </w:pPr>
+            <w:r>
+              <w:rPr>
+                <w:sz w:val="9"/>
               </w:rPr>
               <w:t>table 73 / row 12</w:t>
             </w:r>
@@ -29443,11 +30181,20 @@
         <w:tc>
           <w:tcPr>
             <w:tcW w:type="dxa" w:w="1584"/>
-          </w:tcPr>
-          <w:p>
-            <w:r>
-              <w:rPr>
-                <w:sz w:val="12"/>
+            <w:tcMar>
+              <w:top w:w="12" w:type="dxa"/>
+              <w:bottom w:w="12" w:type="dxa"/>
+              <w:left w:w="24" w:type="dxa"/>
+              <w:right w:w="24" w:type="dxa"/>
+            </w:tcMar>
+          </w:tcPr>
+          <w:p>
+            <w:pPr>
+              <w:spacing w:before="0" w:after="0" w:line="240" w:lineRule="auto"/>
+            </w:pPr>
+            <w:r>
+              <w:rPr>
+                <w:sz w:val="9"/>
               </w:rPr>
               <w:t>PAGE_READ</w:t>
             </w:r>
@@ -29456,11 +30203,20 @@
         <w:tc>
           <w:tcPr>
             <w:tcW w:type="dxa" w:w="1584"/>
-          </w:tcPr>
-          <w:p>
-            <w:r>
-              <w:rPr>
-                <w:sz w:val="12"/>
+            <w:tcMar>
+              <w:top w:w="12" w:type="dxa"/>
+              <w:bottom w:w="12" w:type="dxa"/>
+              <w:left w:w="24" w:type="dxa"/>
+              <w:right w:w="24" w:type="dxa"/>
+            </w:tcMar>
+          </w:tcPr>
+          <w:p>
+            <w:pPr>
+              <w:spacing w:before="0" w:after="0" w:line="240" w:lineRule="auto"/>
+            </w:pPr>
+            <w:r>
+              <w:rPr>
+                <w:sz w:val="9"/>
               </w:rPr>
               <w:t>ALIAS_ONLY / EXCLUDE_FROM_CONTROL_DENOMINATOR</w:t>
             </w:r>
@@ -29471,11 +30227,20 @@
         <w:tc>
           <w:tcPr>
             <w:tcW w:type="dxa" w:w="1584"/>
-          </w:tcPr>
-          <w:p>
-            <w:r>
-              <w:rPr>
-                <w:sz w:val="12"/>
+            <w:tcMar>
+              <w:top w:w="12" w:type="dxa"/>
+              <w:bottom w:w="12" w:type="dxa"/>
+              <w:left w:w="24" w:type="dxa"/>
+              <w:right w:w="24" w:type="dxa"/>
+            </w:tcMar>
+          </w:tcPr>
+          <w:p>
+            <w:pPr>
+              <w:spacing w:before="0" w:after="0" w:line="240" w:lineRule="auto"/>
+            </w:pPr>
+            <w:r>
+              <w:rPr>
+                <w:sz w:val="9"/>
               </w:rPr>
               <w:t>CTRL-…PROJECT-PROGRESS-OVERVIEW-OPEN</w:t>
             </w:r>
@@ -29484,11 +30249,20 @@
         <w:tc>
           <w:tcPr>
             <w:tcW w:type="dxa" w:w="1584"/>
-          </w:tcPr>
-          <w:p>
-            <w:r>
-              <w:rPr>
-                <w:sz w:val="12"/>
+            <w:tcMar>
+              <w:top w:w="12" w:type="dxa"/>
+              <w:bottom w:w="12" w:type="dxa"/>
+              <w:left w:w="24" w:type="dxa"/>
+              <w:right w:w="24" w:type="dxa"/>
+            </w:tcMar>
+          </w:tcPr>
+          <w:p>
+            <w:pPr>
+              <w:spacing w:before="0" w:after="0" w:line="240" w:lineRule="auto"/>
+            </w:pPr>
+            <w:r>
+              <w:rPr>
+                <w:sz w:val="9"/>
               </w:rPr>
               <w:t>CTRL-WORKSPACE-WB-01-PROJECT-PROGRESS-OVERVIEW-OPEN</w:t>
             </w:r>
@@ -29497,11 +30271,20 @@
         <w:tc>
           <w:tcPr>
             <w:tcW w:type="dxa" w:w="1584"/>
-          </w:tcPr>
-          <w:p>
-            <w:r>
-              <w:rPr>
-                <w:sz w:val="12"/>
+            <w:tcMar>
+              <w:top w:w="12" w:type="dxa"/>
+              <w:bottom w:w="12" w:type="dxa"/>
+              <w:left w:w="24" w:type="dxa"/>
+              <w:right w:w="24" w:type="dxa"/>
+            </w:tcMar>
+          </w:tcPr>
+          <w:p>
+            <w:pPr>
+              <w:spacing w:before="0" w:after="0" w:line="240" w:lineRule="auto"/>
+            </w:pPr>
+            <w:r>
+              <w:rPr>
+                <w:sz w:val="9"/>
               </w:rPr>
               <w:t>01_ACPOS_Global_Intelligent_Brain_Information_Lifecycle_Mother_Basic_Logic_Design_Normative_Contract_v4.docx</w:t>
             </w:r>
@@ -29510,11 +30293,20 @@
         <w:tc>
           <w:tcPr>
             <w:tcW w:type="dxa" w:w="1584"/>
-          </w:tcPr>
-          <w:p>
-            <w:r>
-              <w:rPr>
-                <w:sz w:val="12"/>
+            <w:tcMar>
+              <w:top w:w="12" w:type="dxa"/>
+              <w:bottom w:w="12" w:type="dxa"/>
+              <w:left w:w="24" w:type="dxa"/>
+              <w:right w:w="24" w:type="dxa"/>
+            </w:tcMar>
+          </w:tcPr>
+          <w:p>
+            <w:pPr>
+              <w:spacing w:before="0" w:after="0" w:line="240" w:lineRule="auto"/>
+            </w:pPr>
+            <w:r>
+              <w:rPr>
+                <w:sz w:val="9"/>
               </w:rPr>
               <w:t>table 26 / row 8</w:t>
             </w:r>
@@ -29523,11 +30315,20 @@
         <w:tc>
           <w:tcPr>
             <w:tcW w:type="dxa" w:w="1584"/>
-          </w:tcPr>
-          <w:p>
-            <w:r>
-              <w:rPr>
-                <w:sz w:val="12"/>
+            <w:tcMar>
+              <w:top w:w="12" w:type="dxa"/>
+              <w:bottom w:w="12" w:type="dxa"/>
+              <w:left w:w="24" w:type="dxa"/>
+              <w:right w:w="24" w:type="dxa"/>
+            </w:tcMar>
+          </w:tcPr>
+          <w:p>
+            <w:pPr>
+              <w:spacing w:before="0" w:after="0" w:line="240" w:lineRule="auto"/>
+            </w:pPr>
+            <w:r>
+              <w:rPr>
+                <w:sz w:val="9"/>
               </w:rPr>
               <w:t>table 73 / row 13</w:t>
             </w:r>
@@ -29536,11 +30337,20 @@
         <w:tc>
           <w:tcPr>
             <w:tcW w:type="dxa" w:w="1584"/>
-          </w:tcPr>
-          <w:p>
-            <w:r>
-              <w:rPr>
-                <w:sz w:val="12"/>
+            <w:tcMar>
+              <w:top w:w="12" w:type="dxa"/>
+              <w:bottom w:w="12" w:type="dxa"/>
+              <w:left w:w="24" w:type="dxa"/>
+              <w:right w:w="24" w:type="dxa"/>
+            </w:tcMar>
+          </w:tcPr>
+          <w:p>
+            <w:pPr>
+              <w:spacing w:before="0" w:after="0" w:line="240" w:lineRule="auto"/>
+            </w:pPr>
+            <w:r>
+              <w:rPr>
+                <w:sz w:val="9"/>
               </w:rPr>
               <w:t>PAGE_READ</w:t>
             </w:r>
@@ -29549,11 +30359,20 @@
         <w:tc>
           <w:tcPr>
             <w:tcW w:type="dxa" w:w="1584"/>
-          </w:tcPr>
-          <w:p>
-            <w:r>
-              <w:rPr>
-                <w:sz w:val="12"/>
+            <w:tcMar>
+              <w:top w:w="12" w:type="dxa"/>
+              <w:bottom w:w="12" w:type="dxa"/>
+              <w:left w:w="24" w:type="dxa"/>
+              <w:right w:w="24" w:type="dxa"/>
+            </w:tcMar>
+          </w:tcPr>
+          <w:p>
+            <w:pPr>
+              <w:spacing w:before="0" w:after="0" w:line="240" w:lineRule="auto"/>
+            </w:pPr>
+            <w:r>
+              <w:rPr>
+                <w:sz w:val="9"/>
               </w:rPr>
               <w:t>ALIAS_ONLY / EXCLUDE_FROM_CONTROL_DENOMINATOR</w:t>
             </w:r>
@@ -29564,11 +30383,20 @@
         <w:tc>
           <w:tcPr>
             <w:tcW w:type="dxa" w:w="1584"/>
-          </w:tcPr>
-          <w:p>
-            <w:r>
-              <w:rPr>
-                <w:sz w:val="12"/>
+            <w:tcMar>
+              <w:top w:w="12" w:type="dxa"/>
+              <w:bottom w:w="12" w:type="dxa"/>
+              <w:left w:w="24" w:type="dxa"/>
+              <w:right w:w="24" w:type="dxa"/>
+            </w:tcMar>
+          </w:tcPr>
+          <w:p>
+            <w:pPr>
+              <w:spacing w:before="0" w:after="0" w:line="240" w:lineRule="auto"/>
+            </w:pPr>
+            <w:r>
+              <w:rPr>
+                <w:sz w:val="9"/>
               </w:rPr>
               <w:t>CTRL-…RECENT-COMPLETIONS-OPEN</w:t>
             </w:r>
@@ -29577,11 +30405,20 @@
         <w:tc>
           <w:tcPr>
             <w:tcW w:type="dxa" w:w="1584"/>
-          </w:tcPr>
-          <w:p>
-            <w:r>
-              <w:rPr>
-                <w:sz w:val="12"/>
+            <w:tcMar>
+              <w:top w:w="12" w:type="dxa"/>
+              <w:bottom w:w="12" w:type="dxa"/>
+              <w:left w:w="24" w:type="dxa"/>
+              <w:right w:w="24" w:type="dxa"/>
+            </w:tcMar>
+          </w:tcPr>
+          <w:p>
+            <w:pPr>
+              <w:spacing w:before="0" w:after="0" w:line="240" w:lineRule="auto"/>
+            </w:pPr>
+            <w:r>
+              <w:rPr>
+                <w:sz w:val="9"/>
               </w:rPr>
               <w:t>CTRL-WORKSPACE-WB-01-RECENT-COMPLETIONS-OPEN</w:t>
             </w:r>
@@ -29590,11 +30427,20 @@
         <w:tc>
           <w:tcPr>
             <w:tcW w:type="dxa" w:w="1584"/>
-          </w:tcPr>
-          <w:p>
-            <w:r>
-              <w:rPr>
-                <w:sz w:val="12"/>
+            <w:tcMar>
+              <w:top w:w="12" w:type="dxa"/>
+              <w:bottom w:w="12" w:type="dxa"/>
+              <w:left w:w="24" w:type="dxa"/>
+              <w:right w:w="24" w:type="dxa"/>
+            </w:tcMar>
+          </w:tcPr>
+          <w:p>
+            <w:pPr>
+              <w:spacing w:before="0" w:after="0" w:line="240" w:lineRule="auto"/>
+            </w:pPr>
+            <w:r>
+              <w:rPr>
+                <w:sz w:val="9"/>
               </w:rPr>
               <w:t>01_ACPOS_Global_Intelligent_Brain_Information_Lifecycle_Mother_Basic_Logic_Design_Normative_Contract_v4.docx</w:t>
             </w:r>
@@ -29603,11 +30449,20 @@
         <w:tc>
           <w:tcPr>
             <w:tcW w:type="dxa" w:w="1584"/>
-          </w:tcPr>
-          <w:p>
-            <w:r>
-              <w:rPr>
-                <w:sz w:val="12"/>
+            <w:tcMar>
+              <w:top w:w="12" w:type="dxa"/>
+              <w:bottom w:w="12" w:type="dxa"/>
+              <w:left w:w="24" w:type="dxa"/>
+              <w:right w:w="24" w:type="dxa"/>
+            </w:tcMar>
+          </w:tcPr>
+          <w:p>
+            <w:pPr>
+              <w:spacing w:before="0" w:after="0" w:line="240" w:lineRule="auto"/>
+            </w:pPr>
+            <w:r>
+              <w:rPr>
+                <w:sz w:val="9"/>
               </w:rPr>
               <w:t>table 26 / row 15</w:t>
             </w:r>
@@ -29616,11 +30471,20 @@
         <w:tc>
           <w:tcPr>
             <w:tcW w:type="dxa" w:w="1584"/>
-          </w:tcPr>
-          <w:p>
-            <w:r>
-              <w:rPr>
-                <w:sz w:val="12"/>
+            <w:tcMar>
+              <w:top w:w="12" w:type="dxa"/>
+              <w:bottom w:w="12" w:type="dxa"/>
+              <w:left w:w="24" w:type="dxa"/>
+              <w:right w:w="24" w:type="dxa"/>
+            </w:tcMar>
+          </w:tcPr>
+          <w:p>
+            <w:pPr>
+              <w:spacing w:before="0" w:after="0" w:line="240" w:lineRule="auto"/>
+            </w:pPr>
+            <w:r>
+              <w:rPr>
+                <w:sz w:val="9"/>
               </w:rPr>
               <w:t>table 73 / row 14</w:t>
             </w:r>
@@ -29629,11 +30493,20 @@
         <w:tc>
           <w:tcPr>
             <w:tcW w:type="dxa" w:w="1584"/>
-          </w:tcPr>
-          <w:p>
-            <w:r>
-              <w:rPr>
-                <w:sz w:val="12"/>
+            <w:tcMar>
+              <w:top w:w="12" w:type="dxa"/>
+              <w:bottom w:w="12" w:type="dxa"/>
+              <w:left w:w="24" w:type="dxa"/>
+              <w:right w:w="24" w:type="dxa"/>
+            </w:tcMar>
+          </w:tcPr>
+          <w:p>
+            <w:pPr>
+              <w:spacing w:before="0" w:after="0" w:line="240" w:lineRule="auto"/>
+            </w:pPr>
+            <w:r>
+              <w:rPr>
+                <w:sz w:val="9"/>
               </w:rPr>
               <w:t>PAGE_READ</w:t>
             </w:r>
@@ -29642,11 +30515,20 @@
         <w:tc>
           <w:tcPr>
             <w:tcW w:type="dxa" w:w="1584"/>
-          </w:tcPr>
-          <w:p>
-            <w:r>
-              <w:rPr>
-                <w:sz w:val="12"/>
+            <w:tcMar>
+              <w:top w:w="12" w:type="dxa"/>
+              <w:bottom w:w="12" w:type="dxa"/>
+              <w:left w:w="24" w:type="dxa"/>
+              <w:right w:w="24" w:type="dxa"/>
+            </w:tcMar>
+          </w:tcPr>
+          <w:p>
+            <w:pPr>
+              <w:spacing w:before="0" w:after="0" w:line="240" w:lineRule="auto"/>
+            </w:pPr>
+            <w:r>
+              <w:rPr>
+                <w:sz w:val="9"/>
               </w:rPr>
               <w:t>ALIAS_ONLY / EXCLUDE_FROM_CONTROL_DENOMINATOR</w:t>
             </w:r>
@@ -29657,11 +30539,20 @@
         <w:tc>
           <w:tcPr>
             <w:tcW w:type="dxa" w:w="1584"/>
-          </w:tcPr>
-          <w:p>
-            <w:r>
-              <w:rPr>
-                <w:sz w:val="12"/>
+            <w:tcMar>
+              <w:top w:w="12" w:type="dxa"/>
+              <w:bottom w:w="12" w:type="dxa"/>
+              <w:left w:w="24" w:type="dxa"/>
+              <w:right w:w="24" w:type="dxa"/>
+            </w:tcMar>
+          </w:tcPr>
+          <w:p>
+            <w:pPr>
+              <w:spacing w:before="0" w:after="0" w:line="240" w:lineRule="auto"/>
+            </w:pPr>
+            <w:r>
+              <w:rPr>
+                <w:sz w:val="9"/>
               </w:rPr>
               <w:t>CTRL-…SYSTEM-STATUS-SUMMARY-OPEN</w:t>
             </w:r>
@@ -29670,11 +30561,20 @@
         <w:tc>
           <w:tcPr>
             <w:tcW w:type="dxa" w:w="1584"/>
-          </w:tcPr>
-          <w:p>
-            <w:r>
-              <w:rPr>
-                <w:sz w:val="12"/>
+            <w:tcMar>
+              <w:top w:w="12" w:type="dxa"/>
+              <w:bottom w:w="12" w:type="dxa"/>
+              <w:left w:w="24" w:type="dxa"/>
+              <w:right w:w="24" w:type="dxa"/>
+            </w:tcMar>
+          </w:tcPr>
+          <w:p>
+            <w:pPr>
+              <w:spacing w:before="0" w:after="0" w:line="240" w:lineRule="auto"/>
+            </w:pPr>
+            <w:r>
+              <w:rPr>
+                <w:sz w:val="9"/>
               </w:rPr>
               <w:t>CTRL-WORKSPACE-WB-01-SYSTEM-STATUS-SUMMARY-OPEN</w:t>
             </w:r>
@@ -29683,11 +30583,20 @@
         <w:tc>
           <w:tcPr>
             <w:tcW w:type="dxa" w:w="1584"/>
-          </w:tcPr>
-          <w:p>
-            <w:r>
-              <w:rPr>
-                <w:sz w:val="12"/>
+            <w:tcMar>
+              <w:top w:w="12" w:type="dxa"/>
+              <w:bottom w:w="12" w:type="dxa"/>
+              <w:left w:w="24" w:type="dxa"/>
+              <w:right w:w="24" w:type="dxa"/>
+            </w:tcMar>
+          </w:tcPr>
+          <w:p>
+            <w:pPr>
+              <w:spacing w:before="0" w:after="0" w:line="240" w:lineRule="auto"/>
+            </w:pPr>
+            <w:r>
+              <w:rPr>
+                <w:sz w:val="9"/>
               </w:rPr>
               <w:t>01_ACPOS_Global_Intelligent_Brain_Information_Lifecycle_Mother_Basic_Logic_Design_Normative_Contract_v4.docx</w:t>
             </w:r>
@@ -29696,11 +30605,20 @@
         <w:tc>
           <w:tcPr>
             <w:tcW w:type="dxa" w:w="1584"/>
-          </w:tcPr>
-          <w:p>
-            <w:r>
-              <w:rPr>
-                <w:sz w:val="12"/>
+            <w:tcMar>
+              <w:top w:w="12" w:type="dxa"/>
+              <w:bottom w:w="12" w:type="dxa"/>
+              <w:left w:w="24" w:type="dxa"/>
+              <w:right w:w="24" w:type="dxa"/>
+            </w:tcMar>
+          </w:tcPr>
+          <w:p>
+            <w:pPr>
+              <w:spacing w:before="0" w:after="0" w:line="240" w:lineRule="auto"/>
+            </w:pPr>
+            <w:r>
+              <w:rPr>
+                <w:sz w:val="9"/>
               </w:rPr>
               <w:t>table 26 / row 14</w:t>
             </w:r>
@@ -29709,11 +30627,20 @@
         <w:tc>
           <w:tcPr>
             <w:tcW w:type="dxa" w:w="1584"/>
-          </w:tcPr>
-          <w:p>
-            <w:r>
-              <w:rPr>
-                <w:sz w:val="12"/>
+            <w:tcMar>
+              <w:top w:w="12" w:type="dxa"/>
+              <w:bottom w:w="12" w:type="dxa"/>
+              <w:left w:w="24" w:type="dxa"/>
+              <w:right w:w="24" w:type="dxa"/>
+            </w:tcMar>
+          </w:tcPr>
+          <w:p>
+            <w:pPr>
+              <w:spacing w:before="0" w:after="0" w:line="240" w:lineRule="auto"/>
+            </w:pPr>
+            <w:r>
+              <w:rPr>
+                <w:sz w:val="9"/>
               </w:rPr>
               <w:t>table 73 / row 15</w:t>
             </w:r>
@@ -29722,11 +30649,20 @@
         <w:tc>
           <w:tcPr>
             <w:tcW w:type="dxa" w:w="1584"/>
-          </w:tcPr>
-          <w:p>
-            <w:r>
-              <w:rPr>
-                <w:sz w:val="12"/>
+            <w:tcMar>
+              <w:top w:w="12" w:type="dxa"/>
+              <w:bottom w:w="12" w:type="dxa"/>
+              <w:left w:w="24" w:type="dxa"/>
+              <w:right w:w="24" w:type="dxa"/>
+            </w:tcMar>
+          </w:tcPr>
+          <w:p>
+            <w:pPr>
+              <w:spacing w:before="0" w:after="0" w:line="240" w:lineRule="auto"/>
+            </w:pPr>
+            <w:r>
+              <w:rPr>
+                <w:sz w:val="9"/>
               </w:rPr>
               <w:t>PAGE_READ</w:t>
             </w:r>
@@ -29735,11 +30671,20 @@
         <w:tc>
           <w:tcPr>
             <w:tcW w:type="dxa" w:w="1584"/>
-          </w:tcPr>
-          <w:p>
-            <w:r>
-              <w:rPr>
-                <w:sz w:val="12"/>
+            <w:tcMar>
+              <w:top w:w="12" w:type="dxa"/>
+              <w:bottom w:w="12" w:type="dxa"/>
+              <w:left w:w="24" w:type="dxa"/>
+              <w:right w:w="24" w:type="dxa"/>
+            </w:tcMar>
+          </w:tcPr>
+          <w:p>
+            <w:pPr>
+              <w:spacing w:before="0" w:after="0" w:line="240" w:lineRule="auto"/>
+            </w:pPr>
+            <w:r>
+              <w:rPr>
+                <w:sz w:val="9"/>
               </w:rPr>
               <w:t>ALIAS_ONLY / EXCLUDE_FROM_CONTROL_DENOMINATOR</w:t>
             </w:r>
@@ -29748,13 +30693,19 @@
       </w:tr>
     </w:tbl>
     <w:p>
+      <w:pPr>
+        <w:spacing w:before="40" w:after="0" w:line="240" w:lineRule="auto"/>
+      </w:pPr>
       <w:r>
+        <w:rPr>
+          <w:sz w:val="16"/>
+        </w:rPr>
         <w:t>Action UID remains '—' on the actual canonical product rows and is not remediated in Batch 11. Those canonical rows remain part of the separate unique-owner specification-remediation denominator.</w:t>
       </w:r>
     </w:p>
     <w:sectPr>
       <w:pgSz w:w="12240" w:h="15840" w:orient="landscape"/>
-      <w:pgMar w:top="576" w:right="576" w:bottom="576" w:left="576" w:header="720" w:footer="720" w:gutter="0"/>
+      <w:pgMar w:top="360" w:right="432" w:bottom="360" w:left="432" w:header="720" w:footer="720" w:gutter="0"/>
       <w:cols w:space="720"/>
       <w:docGrid w:linePitch="360"/>
     </w:sectPr>

</xml_diff>